<commit_message>
refactor selenium reporting and appointment tests
</commit_message>
<xml_diff>
--- a/Selenium_WebDriver/reports/Notification_Test_Report.docx
+++ b/Selenium_WebDriver/reports/Notification_Test_Report.docx
@@ -14,6 +14,14 @@
         <w:t>BÁO CÁO KẾT QUẢ KIỂM THỬ TỰ ĐỘNG</w:t>
         <w:br/>
         <w:t>CHỨC NĂNG THÔNG BÁO</w:t>
+      </w:r>
+    </w:p>
+    <w:p>
+      <w:pPr>
+        <w:jc w:val="center"/>
+      </w:pPr>
+      <w:r>
+        <w:t>Thời gian tạo báo cáo: 28/08/2026 10:23:39</w:t>
       </w:r>
     </w:p>
     <w:p/>
@@ -74,7 +82,7 @@
           </w:tcPr>
           <w:p>
             <w:r>
-              <w:t>9</w:t>
+              <w:t>1</w:t>
             </w:r>
           </w:p>
         </w:tc>
@@ -96,7 +104,7 @@
           </w:tcPr>
           <w:p>
             <w:r>
-              <w:t>8</w:t>
+              <w:t>0</w:t>
             </w:r>
           </w:p>
         </w:tc>
@@ -184,14 +192,17 @@
         <w:tblLook w:firstColumn="1" w:firstRow="1" w:lastColumn="0" w:lastRow="0" w:noHBand="0" w:noVBand="1" w:val="04A0"/>
       </w:tblPr>
       <w:tblGrid>
-        <w:gridCol w:w="2880"/>
-        <w:gridCol w:w="2880"/>
-        <w:gridCol w:w="2880"/>
+        <w:gridCol w:w="1440"/>
+        <w:gridCol w:w="1440"/>
+        <w:gridCol w:w="1440"/>
+        <w:gridCol w:w="1440"/>
+        <w:gridCol w:w="1440"/>
+        <w:gridCol w:w="1440"/>
       </w:tblGrid>
       <w:tr>
         <w:tc>
           <w:tcPr>
-            <w:tcW w:type="dxa" w:w="2880"/>
+            <w:tcW w:type="dxa" w:w="1440"/>
           </w:tcPr>
           <w:p>
             <w:r>
@@ -201,7 +212,7 @@
         </w:tc>
         <w:tc>
           <w:tcPr>
-            <w:tcW w:type="dxa" w:w="2880"/>
+            <w:tcW w:type="dxa" w:w="1440"/>
           </w:tcPr>
           <w:p>
             <w:r>
@@ -211,7 +222,37 @@
         </w:tc>
         <w:tc>
           <w:tcPr>
-            <w:tcW w:type="dxa" w:w="2880"/>
+            <w:tcW w:type="dxa" w:w="1440"/>
+          </w:tcPr>
+          <w:p>
+            <w:r>
+              <w:t>Thời gian</w:t>
+            </w:r>
+          </w:p>
+        </w:tc>
+        <w:tc>
+          <w:tcPr>
+            <w:tcW w:type="dxa" w:w="1440"/>
+          </w:tcPr>
+          <w:p>
+            <w:r>
+              <w:t>Duration (s)</w:t>
+            </w:r>
+          </w:p>
+        </w:tc>
+        <w:tc>
+          <w:tcPr>
+            <w:tcW w:type="dxa" w:w="1440"/>
+          </w:tcPr>
+          <w:p>
+            <w:r>
+              <w:t>Screenshot</w:t>
+            </w:r>
+          </w:p>
+        </w:tc>
+        <w:tc>
+          <w:tcPr>
+            <w:tcW w:type="dxa" w:w="1440"/>
           </w:tcPr>
           <w:p>
             <w:r>
@@ -223,247 +264,7 @@
       <w:tr>
         <w:tc>
           <w:tcPr>
-            <w:tcW w:type="dxa" w:w="2880"/>
-          </w:tcPr>
-          <w:p>
-            <w:r>
-              <w:t>TC-NOTIFICATION-001</w:t>
-            </w:r>
-          </w:p>
-        </w:tc>
-        <w:tc>
-          <w:tcPr>
-            <w:tcW w:type="dxa" w:w="2880"/>
-          </w:tcPr>
-          <w:p>
-            <w:r>
-              <w:t>PASSED</w:t>
-            </w:r>
-          </w:p>
-        </w:tc>
-        <w:tc>
-          <w:tcPr>
-            <w:tcW w:type="dxa" w:w="2880"/>
-          </w:tcPr>
-          <w:p>
-            <w:r/>
-          </w:p>
-        </w:tc>
-      </w:tr>
-      <w:tr>
-        <w:tc>
-          <w:tcPr>
-            <w:tcW w:type="dxa" w:w="2880"/>
-          </w:tcPr>
-          <w:p>
-            <w:r>
-              <w:t>TC-NOTIFICATION-002</w:t>
-            </w:r>
-          </w:p>
-        </w:tc>
-        <w:tc>
-          <w:tcPr>
-            <w:tcW w:type="dxa" w:w="2880"/>
-          </w:tcPr>
-          <w:p>
-            <w:r>
-              <w:t>PASSED</w:t>
-            </w:r>
-          </w:p>
-        </w:tc>
-        <w:tc>
-          <w:tcPr>
-            <w:tcW w:type="dxa" w:w="2880"/>
-          </w:tcPr>
-          <w:p>
-            <w:r/>
-          </w:p>
-        </w:tc>
-      </w:tr>
-      <w:tr>
-        <w:tc>
-          <w:tcPr>
-            <w:tcW w:type="dxa" w:w="2880"/>
-          </w:tcPr>
-          <w:p>
-            <w:r>
-              <w:t>TC-NOTIFICATION-003</w:t>
-            </w:r>
-          </w:p>
-        </w:tc>
-        <w:tc>
-          <w:tcPr>
-            <w:tcW w:type="dxa" w:w="2880"/>
-          </w:tcPr>
-          <w:p>
-            <w:r>
-              <w:t>PASSED</w:t>
-            </w:r>
-          </w:p>
-        </w:tc>
-        <w:tc>
-          <w:tcPr>
-            <w:tcW w:type="dxa" w:w="2880"/>
-          </w:tcPr>
-          <w:p>
-            <w:r/>
-          </w:p>
-        </w:tc>
-      </w:tr>
-      <w:tr>
-        <w:tc>
-          <w:tcPr>
-            <w:tcW w:type="dxa" w:w="2880"/>
-          </w:tcPr>
-          <w:p>
-            <w:r>
-              <w:t>TC-NOTIFICATION-004</w:t>
-            </w:r>
-          </w:p>
-        </w:tc>
-        <w:tc>
-          <w:tcPr>
-            <w:tcW w:type="dxa" w:w="2880"/>
-          </w:tcPr>
-          <w:p>
-            <w:r>
-              <w:t>PASSED</w:t>
-            </w:r>
-          </w:p>
-        </w:tc>
-        <w:tc>
-          <w:tcPr>
-            <w:tcW w:type="dxa" w:w="2880"/>
-          </w:tcPr>
-          <w:p>
-            <w:r/>
-          </w:p>
-        </w:tc>
-      </w:tr>
-      <w:tr>
-        <w:tc>
-          <w:tcPr>
-            <w:tcW w:type="dxa" w:w="2880"/>
-          </w:tcPr>
-          <w:p>
-            <w:r>
-              <w:t>TC-NOTIFICATION-005</w:t>
-            </w:r>
-          </w:p>
-        </w:tc>
-        <w:tc>
-          <w:tcPr>
-            <w:tcW w:type="dxa" w:w="2880"/>
-          </w:tcPr>
-          <w:p>
-            <w:r>
-              <w:t>PASSED</w:t>
-            </w:r>
-          </w:p>
-        </w:tc>
-        <w:tc>
-          <w:tcPr>
-            <w:tcW w:type="dxa" w:w="2880"/>
-          </w:tcPr>
-          <w:p>
-            <w:r/>
-          </w:p>
-        </w:tc>
-      </w:tr>
-      <w:tr>
-        <w:tc>
-          <w:tcPr>
-            <w:tcW w:type="dxa" w:w="2880"/>
-          </w:tcPr>
-          <w:p>
-            <w:r>
-              <w:t>TC-NOTIFICATION-006</w:t>
-            </w:r>
-          </w:p>
-        </w:tc>
-        <w:tc>
-          <w:tcPr>
-            <w:tcW w:type="dxa" w:w="2880"/>
-          </w:tcPr>
-          <w:p>
-            <w:r>
-              <w:t>PASSED</w:t>
-            </w:r>
-          </w:p>
-        </w:tc>
-        <w:tc>
-          <w:tcPr>
-            <w:tcW w:type="dxa" w:w="2880"/>
-          </w:tcPr>
-          <w:p>
-            <w:r/>
-          </w:p>
-        </w:tc>
-      </w:tr>
-      <w:tr>
-        <w:tc>
-          <w:tcPr>
-            <w:tcW w:type="dxa" w:w="2880"/>
-          </w:tcPr>
-          <w:p>
-            <w:r>
-              <w:t>TC-NOTIFICATION-007</w:t>
-            </w:r>
-          </w:p>
-        </w:tc>
-        <w:tc>
-          <w:tcPr>
-            <w:tcW w:type="dxa" w:w="2880"/>
-          </w:tcPr>
-          <w:p>
-            <w:r>
-              <w:t>PASSED</w:t>
-            </w:r>
-          </w:p>
-        </w:tc>
-        <w:tc>
-          <w:tcPr>
-            <w:tcW w:type="dxa" w:w="2880"/>
-          </w:tcPr>
-          <w:p>
-            <w:r/>
-          </w:p>
-        </w:tc>
-      </w:tr>
-      <w:tr>
-        <w:tc>
-          <w:tcPr>
-            <w:tcW w:type="dxa" w:w="2880"/>
-          </w:tcPr>
-          <w:p>
-            <w:r>
-              <w:t>TC-NOTIFICATION-008</w:t>
-            </w:r>
-          </w:p>
-        </w:tc>
-        <w:tc>
-          <w:tcPr>
-            <w:tcW w:type="dxa" w:w="2880"/>
-          </w:tcPr>
-          <w:p>
-            <w:r>
-              <w:t>PASSED</w:t>
-            </w:r>
-          </w:p>
-        </w:tc>
-        <w:tc>
-          <w:tcPr>
-            <w:tcW w:type="dxa" w:w="2880"/>
-          </w:tcPr>
-          <w:p>
-            <w:r/>
-          </w:p>
-        </w:tc>
-      </w:tr>
-      <w:tr>
-        <w:tc>
-          <w:tcPr>
-            <w:tcW w:type="dxa" w:w="2880"/>
+            <w:tcW w:type="dxa" w:w="1440"/>
           </w:tcPr>
           <w:p>
             <w:r>
@@ -473,7 +274,7 @@
         </w:tc>
         <w:tc>
           <w:tcPr>
-            <w:tcW w:type="dxa" w:w="2880"/>
+            <w:tcW w:type="dxa" w:w="1440"/>
           </w:tcPr>
           <w:p>
             <w:r>
@@ -483,11 +284,39 @@
         </w:tc>
         <w:tc>
           <w:tcPr>
-            <w:tcW w:type="dxa" w:w="2880"/>
+            <w:tcW w:type="dxa" w:w="1440"/>
           </w:tcPr>
           <w:p>
             <w:r>
-              <w:t>KNOWN BUG - TC-NOTIFICATION-009 | STEP 8 | Trước khi cập nhật có 251 notification, sau khi cập nhật có 251. Hồ sơ bệnh án cập nhật thành công nhưng Patient không nhận được notification mới.</w:t>
+              <w:t>28/08/2026 10:23:37</w:t>
+            </w:r>
+          </w:p>
+        </w:tc>
+        <w:tc>
+          <w:tcPr>
+            <w:tcW w:type="dxa" w:w="1440"/>
+          </w:tcPr>
+          <w:p>
+            <w:r>
+              <w:t>59.57</w:t>
+            </w:r>
+          </w:p>
+        </w:tc>
+        <w:tc>
+          <w:tcPr>
+            <w:tcW w:type="dxa" w:w="1440"/>
+          </w:tcPr>
+          <w:p>
+            <w:r/>
+          </w:p>
+        </w:tc>
+        <w:tc>
+          <w:tcPr>
+            <w:tcW w:type="dxa" w:w="1440"/>
+          </w:tcPr>
+          <w:p>
+            <w:r>
+              <w:t>KNOWN BUG - TC-NOTIFICATION-009 | STEP 8 | Trước khi cập nhật có 259 notification, sau khi cập nhật có 259. Hồ sơ bệnh án cập nhật thành công nhưng Patient không nhận được notification mới.</w:t>
             </w:r>
           </w:p>
         </w:tc>
@@ -509,16 +338,17 @@
         <w:tblLook w:firstColumn="1" w:firstRow="1" w:lastColumn="0" w:lastRow="0" w:noHBand="0" w:noVBand="1" w:val="04A0"/>
       </w:tblPr>
       <w:tblGrid>
-        <w:gridCol w:w="1728"/>
-        <w:gridCol w:w="1728"/>
-        <w:gridCol w:w="1728"/>
-        <w:gridCol w:w="1728"/>
-        <w:gridCol w:w="1728"/>
+        <w:gridCol w:w="1440"/>
+        <w:gridCol w:w="1440"/>
+        <w:gridCol w:w="1440"/>
+        <w:gridCol w:w="1440"/>
+        <w:gridCol w:w="1440"/>
+        <w:gridCol w:w="1440"/>
       </w:tblGrid>
       <w:tr>
         <w:tc>
           <w:tcPr>
-            <w:tcW w:type="dxa" w:w="1728"/>
+            <w:tcW w:type="dxa" w:w="1440"/>
           </w:tcPr>
           <w:p>
             <w:r>
@@ -528,7 +358,7 @@
         </w:tc>
         <w:tc>
           <w:tcPr>
-            <w:tcW w:type="dxa" w:w="1728"/>
+            <w:tcW w:type="dxa" w:w="1440"/>
           </w:tcPr>
           <w:p>
             <w:r>
@@ -538,7 +368,7 @@
         </w:tc>
         <w:tc>
           <w:tcPr>
-            <w:tcW w:type="dxa" w:w="1728"/>
+            <w:tcW w:type="dxa" w:w="1440"/>
           </w:tcPr>
           <w:p>
             <w:r>
@@ -548,7 +378,17 @@
         </w:tc>
         <w:tc>
           <w:tcPr>
-            <w:tcW w:type="dxa" w:w="1728"/>
+            <w:tcW w:type="dxa" w:w="1440"/>
+          </w:tcPr>
+          <w:p>
+            <w:r>
+              <w:t>Thời gian</w:t>
+            </w:r>
+          </w:p>
+        </w:tc>
+        <w:tc>
+          <w:tcPr>
+            <w:tcW w:type="dxa" w:w="1440"/>
           </w:tcPr>
           <w:p>
             <w:r>
@@ -558,7 +398,7 @@
         </w:tc>
         <w:tc>
           <w:tcPr>
-            <w:tcW w:type="dxa" w:w="1728"/>
+            <w:tcW w:type="dxa" w:w="1440"/>
           </w:tcPr>
           <w:p>
             <w:r>
@@ -570,17 +410,17 @@
       <w:tr>
         <w:tc>
           <w:tcPr>
-            <w:tcW w:type="dxa" w:w="1728"/>
+            <w:tcW w:type="dxa" w:w="1440"/>
           </w:tcPr>
           <w:p>
             <w:r>
-              <w:t>TC-NOTIFICATION-001</w:t>
+              <w:t>TC-NOTIFICATION-009</w:t>
             </w:r>
           </w:p>
         </w:tc>
         <w:tc>
           <w:tcPr>
-            <w:tcW w:type="dxa" w:w="1728"/>
+            <w:tcW w:type="dxa" w:w="1440"/>
           </w:tcPr>
           <w:p>
             <w:r>
@@ -590,7 +430,7 @@
         </w:tc>
         <w:tc>
           <w:tcPr>
-            <w:tcW w:type="dxa" w:w="1728"/>
+            <w:tcW w:type="dxa" w:w="1440"/>
           </w:tcPr>
           <w:p>
             <w:r>
@@ -600,17 +440,27 @@
         </w:tc>
         <w:tc>
           <w:tcPr>
-            <w:tcW w:type="dxa" w:w="1728"/>
+            <w:tcW w:type="dxa" w:w="1440"/>
           </w:tcPr>
           <w:p>
             <w:r>
-              <w:t>Patient đặt lịch khám hợp lệ và appointment #281 ở trạng thái pending</w:t>
+              <w:t>28/08/2026 10:23:20</w:t>
             </w:r>
           </w:p>
         </w:tc>
         <w:tc>
           <w:tcPr>
-            <w:tcW w:type="dxa" w:w="1728"/>
+            <w:tcW w:type="dxa" w:w="1440"/>
+          </w:tcPr>
+          <w:p>
+            <w:r>
+              <w:t>Chuẩn bị appointment #296, hồ sơ bệnh án ban đầu và ghi nhận 259 notification trước khi cập nhật</w:t>
+            </w:r>
+          </w:p>
+        </w:tc>
+        <w:tc>
+          <w:tcPr>
+            <w:tcW w:type="dxa" w:w="1440"/>
           </w:tcPr>
           <w:p>
             <w:r/>
@@ -620,17 +470,17 @@
       <w:tr>
         <w:tc>
           <w:tcPr>
-            <w:tcW w:type="dxa" w:w="1728"/>
+            <w:tcW w:type="dxa" w:w="1440"/>
           </w:tcPr>
           <w:p>
             <w:r>
-              <w:t>TC-NOTIFICATION-001</w:t>
+              <w:t>TC-NOTIFICATION-009</w:t>
             </w:r>
           </w:p>
         </w:tc>
         <w:tc>
           <w:tcPr>
-            <w:tcW w:type="dxa" w:w="1728"/>
+            <w:tcW w:type="dxa" w:w="1440"/>
           </w:tcPr>
           <w:p>
             <w:r>
@@ -640,7 +490,7 @@
         </w:tc>
         <w:tc>
           <w:tcPr>
-            <w:tcW w:type="dxa" w:w="1728"/>
+            <w:tcW w:type="dxa" w:w="1440"/>
           </w:tcPr>
           <w:p>
             <w:r>
@@ -650,17 +500,27 @@
         </w:tc>
         <w:tc>
           <w:tcPr>
-            <w:tcW w:type="dxa" w:w="1728"/>
+            <w:tcW w:type="dxa" w:w="1440"/>
           </w:tcPr>
           <w:p>
             <w:r>
-              <w:t>Đăng xuất Patient và đăng nhập Admin thành công</w:t>
+              <w:t>28/08/2026 10:23:26</w:t>
             </w:r>
           </w:p>
         </w:tc>
         <w:tc>
           <w:tcPr>
-            <w:tcW w:type="dxa" w:w="1728"/>
+            <w:tcW w:type="dxa" w:w="1440"/>
+          </w:tcPr>
+          <w:p>
+            <w:r>
+              <w:t>Đăng nhập Doctor phụ trách thành công</w:t>
+            </w:r>
+          </w:p>
+        </w:tc>
+        <w:tc>
+          <w:tcPr>
+            <w:tcW w:type="dxa" w:w="1440"/>
           </w:tcPr>
           <w:p>
             <w:r/>
@@ -670,17 +530,17 @@
       <w:tr>
         <w:tc>
           <w:tcPr>
-            <w:tcW w:type="dxa" w:w="1728"/>
+            <w:tcW w:type="dxa" w:w="1440"/>
           </w:tcPr>
           <w:p>
             <w:r>
-              <w:t>TC-NOTIFICATION-001</w:t>
+              <w:t>TC-NOTIFICATION-009</w:t>
             </w:r>
           </w:p>
         </w:tc>
         <w:tc>
           <w:tcPr>
-            <w:tcW w:type="dxa" w:w="1728"/>
+            <w:tcW w:type="dxa" w:w="1440"/>
           </w:tcPr>
           <w:p>
             <w:r>
@@ -690,7 +550,7 @@
         </w:tc>
         <w:tc>
           <w:tcPr>
-            <w:tcW w:type="dxa" w:w="1728"/>
+            <w:tcW w:type="dxa" w:w="1440"/>
           </w:tcPr>
           <w:p>
             <w:r>
@@ -700,17 +560,27 @@
         </w:tc>
         <w:tc>
           <w:tcPr>
-            <w:tcW w:type="dxa" w:w="1728"/>
+            <w:tcW w:type="dxa" w:w="1440"/>
           </w:tcPr>
           <w:p>
             <w:r>
-              <w:t>Admin xác nhận appointment #281 thành công</w:t>
+              <w:t>28/08/2026 10:23:27</w:t>
             </w:r>
           </w:p>
         </w:tc>
         <w:tc>
           <w:tcPr>
-            <w:tcW w:type="dxa" w:w="1728"/>
+            <w:tcW w:type="dxa" w:w="1440"/>
+          </w:tcPr>
+          <w:p>
+            <w:r>
+              <w:t>Doctor mở hồ sơ của appointment #296 thành công</w:t>
+            </w:r>
+          </w:p>
+        </w:tc>
+        <w:tc>
+          <w:tcPr>
+            <w:tcW w:type="dxa" w:w="1440"/>
           </w:tcPr>
           <w:p>
             <w:r/>
@@ -720,17 +590,17 @@
       <w:tr>
         <w:tc>
           <w:tcPr>
-            <w:tcW w:type="dxa" w:w="1728"/>
+            <w:tcW w:type="dxa" w:w="1440"/>
           </w:tcPr>
           <w:p>
             <w:r>
-              <w:t>TC-NOTIFICATION-001</w:t>
+              <w:t>TC-NOTIFICATION-009</w:t>
             </w:r>
           </w:p>
         </w:tc>
         <w:tc>
           <w:tcPr>
-            <w:tcW w:type="dxa" w:w="1728"/>
+            <w:tcW w:type="dxa" w:w="1440"/>
           </w:tcPr>
           <w:p>
             <w:r>
@@ -740,7 +610,7 @@
         </w:tc>
         <w:tc>
           <w:tcPr>
-            <w:tcW w:type="dxa" w:w="1728"/>
+            <w:tcW w:type="dxa" w:w="1440"/>
           </w:tcPr>
           <w:p>
             <w:r>
@@ -750,17 +620,27 @@
         </w:tc>
         <w:tc>
           <w:tcPr>
-            <w:tcW w:type="dxa" w:w="1728"/>
+            <w:tcW w:type="dxa" w:w="1440"/>
           </w:tcPr>
           <w:p>
             <w:r>
-              <w:t>Đăng xuất Admin và đăng nhập lại Patient thành công</w:t>
+              <w:t>28/08/2026 10:23:28</w:t>
             </w:r>
           </w:p>
         </w:tc>
         <w:tc>
           <w:tcPr>
-            <w:tcW w:type="dxa" w:w="1728"/>
+            <w:tcW w:type="dxa" w:w="1440"/>
+          </w:tcPr>
+          <w:p>
+            <w:r>
+              <w:t>Doctor chỉnh sửa Chẩn đoán và Hướng điều trị thành công</w:t>
+            </w:r>
+          </w:p>
+        </w:tc>
+        <w:tc>
+          <w:tcPr>
+            <w:tcW w:type="dxa" w:w="1440"/>
           </w:tcPr>
           <w:p>
             <w:r/>
@@ -770,17 +650,17 @@
       <w:tr>
         <w:tc>
           <w:tcPr>
-            <w:tcW w:type="dxa" w:w="1728"/>
+            <w:tcW w:type="dxa" w:w="1440"/>
           </w:tcPr>
           <w:p>
             <w:r>
-              <w:t>TC-NOTIFICATION-001</w:t>
+              <w:t>TC-NOTIFICATION-009</w:t>
             </w:r>
           </w:p>
         </w:tc>
         <w:tc>
           <w:tcPr>
-            <w:tcW w:type="dxa" w:w="1728"/>
+            <w:tcW w:type="dxa" w:w="1440"/>
           </w:tcPr>
           <w:p>
             <w:r>
@@ -790,7 +670,7 @@
         </w:tc>
         <w:tc>
           <w:tcPr>
-            <w:tcW w:type="dxa" w:w="1728"/>
+            <w:tcW w:type="dxa" w:w="1440"/>
           </w:tcPr>
           <w:p>
             <w:r>
@@ -800,7 +680,137 @@
         </w:tc>
         <w:tc>
           <w:tcPr>
-            <w:tcW w:type="dxa" w:w="1728"/>
+            <w:tcW w:type="dxa" w:w="1440"/>
+          </w:tcPr>
+          <w:p>
+            <w:r>
+              <w:t>28/08/2026 10:23:29</w:t>
+            </w:r>
+          </w:p>
+        </w:tc>
+        <w:tc>
+          <w:tcPr>
+            <w:tcW w:type="dxa" w:w="1440"/>
+          </w:tcPr>
+          <w:p>
+            <w:r>
+              <w:t>Cập nhật hồ sơ bệnh án thành công</w:t>
+            </w:r>
+          </w:p>
+        </w:tc>
+        <w:tc>
+          <w:tcPr>
+            <w:tcW w:type="dxa" w:w="1440"/>
+          </w:tcPr>
+          <w:p>
+            <w:r/>
+          </w:p>
+        </w:tc>
+      </w:tr>
+      <w:tr>
+        <w:tc>
+          <w:tcPr>
+            <w:tcW w:type="dxa" w:w="1440"/>
+          </w:tcPr>
+          <w:p>
+            <w:r>
+              <w:t>TC-NOTIFICATION-009</w:t>
+            </w:r>
+          </w:p>
+        </w:tc>
+        <w:tc>
+          <w:tcPr>
+            <w:tcW w:type="dxa" w:w="1440"/>
+          </w:tcPr>
+          <w:p>
+            <w:r>
+              <w:t>6</w:t>
+            </w:r>
+          </w:p>
+        </w:tc>
+        <w:tc>
+          <w:tcPr>
+            <w:tcW w:type="dxa" w:w="1440"/>
+          </w:tcPr>
+          <w:p>
+            <w:r>
+              <w:t>PASS</w:t>
+            </w:r>
+          </w:p>
+        </w:tc>
+        <w:tc>
+          <w:tcPr>
+            <w:tcW w:type="dxa" w:w="1440"/>
+          </w:tcPr>
+          <w:p>
+            <w:r>
+              <w:t>28/08/2026 10:23:35</w:t>
+            </w:r>
+          </w:p>
+        </w:tc>
+        <w:tc>
+          <w:tcPr>
+            <w:tcW w:type="dxa" w:w="1440"/>
+          </w:tcPr>
+          <w:p>
+            <w:r>
+              <w:t>Đăng xuất Doctor và đăng nhập lại Patient thành công</w:t>
+            </w:r>
+          </w:p>
+        </w:tc>
+        <w:tc>
+          <w:tcPr>
+            <w:tcW w:type="dxa" w:w="1440"/>
+          </w:tcPr>
+          <w:p>
+            <w:r/>
+          </w:p>
+        </w:tc>
+      </w:tr>
+      <w:tr>
+        <w:tc>
+          <w:tcPr>
+            <w:tcW w:type="dxa" w:w="1440"/>
+          </w:tcPr>
+          <w:p>
+            <w:r>
+              <w:t>TC-NOTIFICATION-009</w:t>
+            </w:r>
+          </w:p>
+        </w:tc>
+        <w:tc>
+          <w:tcPr>
+            <w:tcW w:type="dxa" w:w="1440"/>
+          </w:tcPr>
+          <w:p>
+            <w:r>
+              <w:t>7</w:t>
+            </w:r>
+          </w:p>
+        </w:tc>
+        <w:tc>
+          <w:tcPr>
+            <w:tcW w:type="dxa" w:w="1440"/>
+          </w:tcPr>
+          <w:p>
+            <w:r>
+              <w:t>PASS</w:t>
+            </w:r>
+          </w:p>
+        </w:tc>
+        <w:tc>
+          <w:tcPr>
+            <w:tcW w:type="dxa" w:w="1440"/>
+          </w:tcPr>
+          <w:p>
+            <w:r>
+              <w:t>28/08/2026 10:23:35</w:t>
+            </w:r>
+          </w:p>
+        </w:tc>
+        <w:tc>
+          <w:tcPr>
+            <w:tcW w:type="dxa" w:w="1440"/>
           </w:tcPr>
           <w:p>
             <w:r>
@@ -810,7 +820,7 @@
         </w:tc>
         <w:tc>
           <w:tcPr>
-            <w:tcW w:type="dxa" w:w="1728"/>
+            <w:tcW w:type="dxa" w:w="1440"/>
           </w:tcPr>
           <w:p>
             <w:r/>
@@ -820,817 +830,17 @@
       <w:tr>
         <w:tc>
           <w:tcPr>
-            <w:tcW w:type="dxa" w:w="1728"/>
+            <w:tcW w:type="dxa" w:w="1440"/>
           </w:tcPr>
           <w:p>
             <w:r>
-              <w:t>TC-NOTIFICATION-001</w:t>
+              <w:t>TC-NOTIFICATION-009</w:t>
             </w:r>
           </w:p>
         </w:tc>
         <w:tc>
           <w:tcPr>
-            <w:tcW w:type="dxa" w:w="1728"/>
-          </w:tcPr>
-          <w:p>
-            <w:r>
-              <w:t>6</w:t>
-            </w:r>
-          </w:p>
-        </w:tc>
-        <w:tc>
-          <w:tcPr>
-            <w:tcW w:type="dxa" w:w="1728"/>
-          </w:tcPr>
-          <w:p>
-            <w:r>
-              <w:t>PASS</w:t>
-            </w:r>
-          </w:p>
-        </w:tc>
-        <w:tc>
-          <w:tcPr>
-            <w:tcW w:type="dxa" w:w="1728"/>
-          </w:tcPr>
-          <w:p>
-            <w:r>
-              <w:t>Tìm thấy notification của appointment #281</w:t>
-            </w:r>
-          </w:p>
-        </w:tc>
-        <w:tc>
-          <w:tcPr>
-            <w:tcW w:type="dxa" w:w="1728"/>
-          </w:tcPr>
-          <w:p>
-            <w:r/>
-          </w:p>
-        </w:tc>
-      </w:tr>
-      <w:tr>
-        <w:tc>
-          <w:tcPr>
-            <w:tcW w:type="dxa" w:w="1728"/>
-          </w:tcPr>
-          <w:p>
-            <w:r>
-              <w:t>TC-NOTIFICATION-001</w:t>
-            </w:r>
-          </w:p>
-        </w:tc>
-        <w:tc>
-          <w:tcPr>
-            <w:tcW w:type="dxa" w:w="1728"/>
-          </w:tcPr>
-          <w:p>
-            <w:r>
-              <w:t>7</w:t>
-            </w:r>
-          </w:p>
-        </w:tc>
-        <w:tc>
-          <w:tcPr>
-            <w:tcW w:type="dxa" w:w="1728"/>
-          </w:tcPr>
-          <w:p>
-            <w:r>
-              <w:t>PASS</w:t>
-            </w:r>
-          </w:p>
-        </w:tc>
-        <w:tc>
-          <w:tcPr>
-            <w:tcW w:type="dxa" w:w="1728"/>
-          </w:tcPr>
-          <w:p>
-            <w:r>
-              <w:t>Notification đúng loại, đúng appointment, đúng nội dung và đúng định dạng thời gian</w:t>
-            </w:r>
-          </w:p>
-        </w:tc>
-        <w:tc>
-          <w:tcPr>
-            <w:tcW w:type="dxa" w:w="1728"/>
-          </w:tcPr>
-          <w:p>
-            <w:r/>
-          </w:p>
-        </w:tc>
-      </w:tr>
-      <w:tr>
-        <w:tc>
-          <w:tcPr>
-            <w:tcW w:type="dxa" w:w="1728"/>
-          </w:tcPr>
-          <w:p>
-            <w:r>
-              <w:t>TC-NOTIFICATION-002</w:t>
-            </w:r>
-          </w:p>
-        </w:tc>
-        <w:tc>
-          <w:tcPr>
-            <w:tcW w:type="dxa" w:w="1728"/>
-          </w:tcPr>
-          <w:p>
-            <w:r>
-              <w:t>1</w:t>
-            </w:r>
-          </w:p>
-        </w:tc>
-        <w:tc>
-          <w:tcPr>
-            <w:tcW w:type="dxa" w:w="1728"/>
-          </w:tcPr>
-          <w:p>
-            <w:r>
-              <w:t>PASS</w:t>
-            </w:r>
-          </w:p>
-        </w:tc>
-        <w:tc>
-          <w:tcPr>
-            <w:tcW w:type="dxa" w:w="1728"/>
-          </w:tcPr>
-          <w:p>
-            <w:r>
-              <w:t>Patient đặt lịch khám hợp lệ và appointment #282 ở trạng thái pending</w:t>
-            </w:r>
-          </w:p>
-        </w:tc>
-        <w:tc>
-          <w:tcPr>
-            <w:tcW w:type="dxa" w:w="1728"/>
-          </w:tcPr>
-          <w:p>
-            <w:r/>
-          </w:p>
-        </w:tc>
-      </w:tr>
-      <w:tr>
-        <w:tc>
-          <w:tcPr>
-            <w:tcW w:type="dxa" w:w="1728"/>
-          </w:tcPr>
-          <w:p>
-            <w:r>
-              <w:t>TC-NOTIFICATION-002</w:t>
-            </w:r>
-          </w:p>
-        </w:tc>
-        <w:tc>
-          <w:tcPr>
-            <w:tcW w:type="dxa" w:w="1728"/>
-          </w:tcPr>
-          <w:p>
-            <w:r>
-              <w:t>2</w:t>
-            </w:r>
-          </w:p>
-        </w:tc>
-        <w:tc>
-          <w:tcPr>
-            <w:tcW w:type="dxa" w:w="1728"/>
-          </w:tcPr>
-          <w:p>
-            <w:r>
-              <w:t>PASS</w:t>
-            </w:r>
-          </w:p>
-        </w:tc>
-        <w:tc>
-          <w:tcPr>
-            <w:tcW w:type="dxa" w:w="1728"/>
-          </w:tcPr>
-          <w:p>
-            <w:r>
-              <w:t>Đăng xuất Patient và đăng nhập Admin thành công</w:t>
-            </w:r>
-          </w:p>
-        </w:tc>
-        <w:tc>
-          <w:tcPr>
-            <w:tcW w:type="dxa" w:w="1728"/>
-          </w:tcPr>
-          <w:p>
-            <w:r/>
-          </w:p>
-        </w:tc>
-      </w:tr>
-      <w:tr>
-        <w:tc>
-          <w:tcPr>
-            <w:tcW w:type="dxa" w:w="1728"/>
-          </w:tcPr>
-          <w:p>
-            <w:r>
-              <w:t>TC-NOTIFICATION-002</w:t>
-            </w:r>
-          </w:p>
-        </w:tc>
-        <w:tc>
-          <w:tcPr>
-            <w:tcW w:type="dxa" w:w="1728"/>
-          </w:tcPr>
-          <w:p>
-            <w:r>
-              <w:t>3</w:t>
-            </w:r>
-          </w:p>
-        </w:tc>
-        <w:tc>
-          <w:tcPr>
-            <w:tcW w:type="dxa" w:w="1728"/>
-          </w:tcPr>
-          <w:p>
-            <w:r>
-              <w:t>PASS</w:t>
-            </w:r>
-          </w:p>
-        </w:tc>
-        <w:tc>
-          <w:tcPr>
-            <w:tcW w:type="dxa" w:w="1728"/>
-          </w:tcPr>
-          <w:p>
-            <w:r>
-              <w:t>Admin hủy appointment #282 thành công</w:t>
-            </w:r>
-          </w:p>
-        </w:tc>
-        <w:tc>
-          <w:tcPr>
-            <w:tcW w:type="dxa" w:w="1728"/>
-          </w:tcPr>
-          <w:p>
-            <w:r/>
-          </w:p>
-        </w:tc>
-      </w:tr>
-      <w:tr>
-        <w:tc>
-          <w:tcPr>
-            <w:tcW w:type="dxa" w:w="1728"/>
-          </w:tcPr>
-          <w:p>
-            <w:r>
-              <w:t>TC-NOTIFICATION-002</w:t>
-            </w:r>
-          </w:p>
-        </w:tc>
-        <w:tc>
-          <w:tcPr>
-            <w:tcW w:type="dxa" w:w="1728"/>
-          </w:tcPr>
-          <w:p>
-            <w:r>
-              <w:t>4</w:t>
-            </w:r>
-          </w:p>
-        </w:tc>
-        <w:tc>
-          <w:tcPr>
-            <w:tcW w:type="dxa" w:w="1728"/>
-          </w:tcPr>
-          <w:p>
-            <w:r>
-              <w:t>PASS</w:t>
-            </w:r>
-          </w:p>
-        </w:tc>
-        <w:tc>
-          <w:tcPr>
-            <w:tcW w:type="dxa" w:w="1728"/>
-          </w:tcPr>
-          <w:p>
-            <w:r>
-              <w:t>Đăng xuất Admin và đăng nhập lại Patient thành công</w:t>
-            </w:r>
-          </w:p>
-        </w:tc>
-        <w:tc>
-          <w:tcPr>
-            <w:tcW w:type="dxa" w:w="1728"/>
-          </w:tcPr>
-          <w:p>
-            <w:r/>
-          </w:p>
-        </w:tc>
-      </w:tr>
-      <w:tr>
-        <w:tc>
-          <w:tcPr>
-            <w:tcW w:type="dxa" w:w="1728"/>
-          </w:tcPr>
-          <w:p>
-            <w:r>
-              <w:t>TC-NOTIFICATION-002</w:t>
-            </w:r>
-          </w:p>
-        </w:tc>
-        <w:tc>
-          <w:tcPr>
-            <w:tcW w:type="dxa" w:w="1728"/>
-          </w:tcPr>
-          <w:p>
-            <w:r>
-              <w:t>5</w:t>
-            </w:r>
-          </w:p>
-        </w:tc>
-        <w:tc>
-          <w:tcPr>
-            <w:tcW w:type="dxa" w:w="1728"/>
-          </w:tcPr>
-          <w:p>
-            <w:r>
-              <w:t>PASS</w:t>
-            </w:r>
-          </w:p>
-        </w:tc>
-        <w:tc>
-          <w:tcPr>
-            <w:tcW w:type="dxa" w:w="1728"/>
-          </w:tcPr>
-          <w:p>
-            <w:r>
-              <w:t>Patient mở trang Thông báo thành công</w:t>
-            </w:r>
-          </w:p>
-        </w:tc>
-        <w:tc>
-          <w:tcPr>
-            <w:tcW w:type="dxa" w:w="1728"/>
-          </w:tcPr>
-          <w:p>
-            <w:r/>
-          </w:p>
-        </w:tc>
-      </w:tr>
-      <w:tr>
-        <w:tc>
-          <w:tcPr>
-            <w:tcW w:type="dxa" w:w="1728"/>
-          </w:tcPr>
-          <w:p>
-            <w:r>
-              <w:t>TC-NOTIFICATION-002</w:t>
-            </w:r>
-          </w:p>
-        </w:tc>
-        <w:tc>
-          <w:tcPr>
-            <w:tcW w:type="dxa" w:w="1728"/>
-          </w:tcPr>
-          <w:p>
-            <w:r>
-              <w:t>6</w:t>
-            </w:r>
-          </w:p>
-        </w:tc>
-        <w:tc>
-          <w:tcPr>
-            <w:tcW w:type="dxa" w:w="1728"/>
-          </w:tcPr>
-          <w:p>
-            <w:r>
-              <w:t>PASS</w:t>
-            </w:r>
-          </w:p>
-        </w:tc>
-        <w:tc>
-          <w:tcPr>
-            <w:tcW w:type="dxa" w:w="1728"/>
-          </w:tcPr>
-          <w:p>
-            <w:r>
-              <w:t>Tìm thấy notification của appointment #282</w:t>
-            </w:r>
-          </w:p>
-        </w:tc>
-        <w:tc>
-          <w:tcPr>
-            <w:tcW w:type="dxa" w:w="1728"/>
-          </w:tcPr>
-          <w:p>
-            <w:r/>
-          </w:p>
-        </w:tc>
-      </w:tr>
-      <w:tr>
-        <w:tc>
-          <w:tcPr>
-            <w:tcW w:type="dxa" w:w="1728"/>
-          </w:tcPr>
-          <w:p>
-            <w:r>
-              <w:t>TC-NOTIFICATION-002</w:t>
-            </w:r>
-          </w:p>
-        </w:tc>
-        <w:tc>
-          <w:tcPr>
-            <w:tcW w:type="dxa" w:w="1728"/>
-          </w:tcPr>
-          <w:p>
-            <w:r>
-              <w:t>7</w:t>
-            </w:r>
-          </w:p>
-        </w:tc>
-        <w:tc>
-          <w:tcPr>
-            <w:tcW w:type="dxa" w:w="1728"/>
-          </w:tcPr>
-          <w:p>
-            <w:r>
-              <w:t>PASS</w:t>
-            </w:r>
-          </w:p>
-        </w:tc>
-        <w:tc>
-          <w:tcPr>
-            <w:tcW w:type="dxa" w:w="1728"/>
-          </w:tcPr>
-          <w:p>
-            <w:r>
-              <w:t>Notification đúng loại, đúng appointment, đúng nội dung hủy lịch và đúng định dạng thời gian</w:t>
-            </w:r>
-          </w:p>
-        </w:tc>
-        <w:tc>
-          <w:tcPr>
-            <w:tcW w:type="dxa" w:w="1728"/>
-          </w:tcPr>
-          <w:p>
-            <w:r/>
-          </w:p>
-        </w:tc>
-      </w:tr>
-      <w:tr>
-        <w:tc>
-          <w:tcPr>
-            <w:tcW w:type="dxa" w:w="1728"/>
-          </w:tcPr>
-          <w:p>
-            <w:r>
-              <w:t>TC-NOTIFICATION-003</w:t>
-            </w:r>
-          </w:p>
-        </w:tc>
-        <w:tc>
-          <w:tcPr>
-            <w:tcW w:type="dxa" w:w="1728"/>
-          </w:tcPr>
-          <w:p>
-            <w:r>
-              <w:t>1</w:t>
-            </w:r>
-          </w:p>
-        </w:tc>
-        <w:tc>
-          <w:tcPr>
-            <w:tcW w:type="dxa" w:w="1728"/>
-          </w:tcPr>
-          <w:p>
-            <w:r>
-              <w:t>PASS</w:t>
-            </w:r>
-          </w:p>
-        </w:tc>
-        <w:tc>
-          <w:tcPr>
-            <w:tcW w:type="dxa" w:w="1728"/>
-          </w:tcPr>
-          <w:p>
-            <w:r>
-              <w:t>Chuẩn bị appointment #283 và Admin xác nhận lịch thành công</w:t>
-            </w:r>
-          </w:p>
-        </w:tc>
-        <w:tc>
-          <w:tcPr>
-            <w:tcW w:type="dxa" w:w="1728"/>
-          </w:tcPr>
-          <w:p>
-            <w:r/>
-          </w:p>
-        </w:tc>
-      </w:tr>
-      <w:tr>
-        <w:tc>
-          <w:tcPr>
-            <w:tcW w:type="dxa" w:w="1728"/>
-          </w:tcPr>
-          <w:p>
-            <w:r>
-              <w:t>TC-NOTIFICATION-003</w:t>
-            </w:r>
-          </w:p>
-        </w:tc>
-        <w:tc>
-          <w:tcPr>
-            <w:tcW w:type="dxa" w:w="1728"/>
-          </w:tcPr>
-          <w:p>
-            <w:r>
-              <w:t>2</w:t>
-            </w:r>
-          </w:p>
-        </w:tc>
-        <w:tc>
-          <w:tcPr>
-            <w:tcW w:type="dxa" w:w="1728"/>
-          </w:tcPr>
-          <w:p>
-            <w:r>
-              <w:t>PASS</w:t>
-            </w:r>
-          </w:p>
-        </w:tc>
-        <w:tc>
-          <w:tcPr>
-            <w:tcW w:type="dxa" w:w="1728"/>
-          </w:tcPr>
-          <w:p>
-            <w:r>
-              <w:t>Đăng nhập Doctor phụ trách thành công</w:t>
-            </w:r>
-          </w:p>
-        </w:tc>
-        <w:tc>
-          <w:tcPr>
-            <w:tcW w:type="dxa" w:w="1728"/>
-          </w:tcPr>
-          <w:p>
-            <w:r/>
-          </w:p>
-        </w:tc>
-      </w:tr>
-      <w:tr>
-        <w:tc>
-          <w:tcPr>
-            <w:tcW w:type="dxa" w:w="1728"/>
-          </w:tcPr>
-          <w:p>
-            <w:r>
-              <w:t>TC-NOTIFICATION-003</w:t>
-            </w:r>
-          </w:p>
-        </w:tc>
-        <w:tc>
-          <w:tcPr>
-            <w:tcW w:type="dxa" w:w="1728"/>
-          </w:tcPr>
-          <w:p>
-            <w:r>
-              <w:t>3</w:t>
-            </w:r>
-          </w:p>
-        </w:tc>
-        <w:tc>
-          <w:tcPr>
-            <w:tcW w:type="dxa" w:w="1728"/>
-          </w:tcPr>
-          <w:p>
-            <w:r>
-              <w:t>PASS</w:t>
-            </w:r>
-          </w:p>
-        </w:tc>
-        <w:tc>
-          <w:tcPr>
-            <w:tcW w:type="dxa" w:w="1728"/>
-          </w:tcPr>
-          <w:p>
-            <w:r>
-              <w:t>Doctor mở appointment #283 và vào màn hình Khám bệnh thành công</w:t>
-            </w:r>
-          </w:p>
-        </w:tc>
-        <w:tc>
-          <w:tcPr>
-            <w:tcW w:type="dxa" w:w="1728"/>
-          </w:tcPr>
-          <w:p>
-            <w:r/>
-          </w:p>
-        </w:tc>
-      </w:tr>
-      <w:tr>
-        <w:tc>
-          <w:tcPr>
-            <w:tcW w:type="dxa" w:w="1728"/>
-          </w:tcPr>
-          <w:p>
-            <w:r>
-              <w:t>TC-NOTIFICATION-003</w:t>
-            </w:r>
-          </w:p>
-        </w:tc>
-        <w:tc>
-          <w:tcPr>
-            <w:tcW w:type="dxa" w:w="1728"/>
-          </w:tcPr>
-          <w:p>
-            <w:r>
-              <w:t>4</w:t>
-            </w:r>
-          </w:p>
-        </w:tc>
-        <w:tc>
-          <w:tcPr>
-            <w:tcW w:type="dxa" w:w="1728"/>
-          </w:tcPr>
-          <w:p>
-            <w:r>
-              <w:t>PASS</w:t>
-            </w:r>
-          </w:p>
-        </w:tc>
-        <w:tc>
-          <w:tcPr>
-            <w:tcW w:type="dxa" w:w="1728"/>
-          </w:tcPr>
-          <w:p>
-            <w:r>
-              <w:t>Doctor nhập Chẩn đoán và Hướng điều trị hợp lệ</w:t>
-            </w:r>
-          </w:p>
-        </w:tc>
-        <w:tc>
-          <w:tcPr>
-            <w:tcW w:type="dxa" w:w="1728"/>
-          </w:tcPr>
-          <w:p>
-            <w:r/>
-          </w:p>
-        </w:tc>
-      </w:tr>
-      <w:tr>
-        <w:tc>
-          <w:tcPr>
-            <w:tcW w:type="dxa" w:w="1728"/>
-          </w:tcPr>
-          <w:p>
-            <w:r>
-              <w:t>TC-NOTIFICATION-003</w:t>
-            </w:r>
-          </w:p>
-        </w:tc>
-        <w:tc>
-          <w:tcPr>
-            <w:tcW w:type="dxa" w:w="1728"/>
-          </w:tcPr>
-          <w:p>
-            <w:r>
-              <w:t>5</w:t>
-            </w:r>
-          </w:p>
-        </w:tc>
-        <w:tc>
-          <w:tcPr>
-            <w:tcW w:type="dxa" w:w="1728"/>
-          </w:tcPr>
-          <w:p>
-            <w:r>
-              <w:t>PASS</w:t>
-            </w:r>
-          </w:p>
-        </w:tc>
-        <w:tc>
-          <w:tcPr>
-            <w:tcW w:type="dxa" w:w="1728"/>
-          </w:tcPr>
-          <w:p>
-            <w:r>
-              <w:t>Doctor lưu hồ sơ bệnh án thành công</w:t>
-            </w:r>
-          </w:p>
-        </w:tc>
-        <w:tc>
-          <w:tcPr>
-            <w:tcW w:type="dxa" w:w="1728"/>
-          </w:tcPr>
-          <w:p>
-            <w:r/>
-          </w:p>
-        </w:tc>
-      </w:tr>
-      <w:tr>
-        <w:tc>
-          <w:tcPr>
-            <w:tcW w:type="dxa" w:w="1728"/>
-          </w:tcPr>
-          <w:p>
-            <w:r>
-              <w:t>TC-NOTIFICATION-003</w:t>
-            </w:r>
-          </w:p>
-        </w:tc>
-        <w:tc>
-          <w:tcPr>
-            <w:tcW w:type="dxa" w:w="1728"/>
-          </w:tcPr>
-          <w:p>
-            <w:r>
-              <w:t>6</w:t>
-            </w:r>
-          </w:p>
-        </w:tc>
-        <w:tc>
-          <w:tcPr>
-            <w:tcW w:type="dxa" w:w="1728"/>
-          </w:tcPr>
-          <w:p>
-            <w:r>
-              <w:t>PASS</w:t>
-            </w:r>
-          </w:p>
-        </w:tc>
-        <w:tc>
-          <w:tcPr>
-            <w:tcW w:type="dxa" w:w="1728"/>
-          </w:tcPr>
-          <w:p>
-            <w:r>
-              <w:t>Đăng xuất Doctor và đăng nhập lại Patient thành công</w:t>
-            </w:r>
-          </w:p>
-        </w:tc>
-        <w:tc>
-          <w:tcPr>
-            <w:tcW w:type="dxa" w:w="1728"/>
-          </w:tcPr>
-          <w:p>
-            <w:r/>
-          </w:p>
-        </w:tc>
-      </w:tr>
-      <w:tr>
-        <w:tc>
-          <w:tcPr>
-            <w:tcW w:type="dxa" w:w="1728"/>
-          </w:tcPr>
-          <w:p>
-            <w:r>
-              <w:t>TC-NOTIFICATION-003</w:t>
-            </w:r>
-          </w:p>
-        </w:tc>
-        <w:tc>
-          <w:tcPr>
-            <w:tcW w:type="dxa" w:w="1728"/>
-          </w:tcPr>
-          <w:p>
-            <w:r>
-              <w:t>7</w:t>
-            </w:r>
-          </w:p>
-        </w:tc>
-        <w:tc>
-          <w:tcPr>
-            <w:tcW w:type="dxa" w:w="1728"/>
-          </w:tcPr>
-          <w:p>
-            <w:r>
-              <w:t>PASS</w:t>
-            </w:r>
-          </w:p>
-        </w:tc>
-        <w:tc>
-          <w:tcPr>
-            <w:tcW w:type="dxa" w:w="1728"/>
-          </w:tcPr>
-          <w:p>
-            <w:r>
-              <w:t>Patient mở trang Thông báo thành công</w:t>
-            </w:r>
-          </w:p>
-        </w:tc>
-        <w:tc>
-          <w:tcPr>
-            <w:tcW w:type="dxa" w:w="1728"/>
-          </w:tcPr>
-          <w:p>
-            <w:r/>
-          </w:p>
-        </w:tc>
-      </w:tr>
-      <w:tr>
-        <w:tc>
-          <w:tcPr>
-            <w:tcW w:type="dxa" w:w="1728"/>
-          </w:tcPr>
-          <w:p>
-            <w:r>
-              <w:t>TC-NOTIFICATION-003</w:t>
-            </w:r>
-          </w:p>
-        </w:tc>
-        <w:tc>
-          <w:tcPr>
-            <w:tcW w:type="dxa" w:w="1728"/>
+            <w:tcW w:type="dxa" w:w="1440"/>
           </w:tcPr>
           <w:p>
             <w:r>
@@ -1640,2357 +850,7 @@
         </w:tc>
         <w:tc>
           <w:tcPr>
-            <w:tcW w:type="dxa" w:w="1728"/>
-          </w:tcPr>
-          <w:p>
-            <w:r>
-              <w:t>PASS</w:t>
-            </w:r>
-          </w:p>
-        </w:tc>
-        <w:tc>
-          <w:tcPr>
-            <w:tcW w:type="dxa" w:w="1728"/>
-          </w:tcPr>
-          <w:p>
-            <w:r>
-              <w:t>Tìm thấy notification cập nhật kết quả khám và kiểm tra loại, nội dung, thời gian thành công</w:t>
-            </w:r>
-          </w:p>
-        </w:tc>
-        <w:tc>
-          <w:tcPr>
-            <w:tcW w:type="dxa" w:w="1728"/>
-          </w:tcPr>
-          <w:p>
-            <w:r/>
-          </w:p>
-        </w:tc>
-      </w:tr>
-      <w:tr>
-        <w:tc>
-          <w:tcPr>
-            <w:tcW w:type="dxa" w:w="1728"/>
-          </w:tcPr>
-          <w:p>
-            <w:r>
-              <w:t>TC-NOTIFICATION-004</w:t>
-            </w:r>
-          </w:p>
-        </w:tc>
-        <w:tc>
-          <w:tcPr>
-            <w:tcW w:type="dxa" w:w="1728"/>
-          </w:tcPr>
-          <w:p>
-            <w:r>
-              <w:t>1</w:t>
-            </w:r>
-          </w:p>
-        </w:tc>
-        <w:tc>
-          <w:tcPr>
-            <w:tcW w:type="dxa" w:w="1728"/>
-          </w:tcPr>
-          <w:p>
-            <w:r>
-              <w:t>PASS</w:t>
-            </w:r>
-          </w:p>
-        </w:tc>
-        <w:tc>
-          <w:tcPr>
-            <w:tcW w:type="dxa" w:w="1728"/>
-          </w:tcPr>
-          <w:p>
-            <w:r>
-              <w:t>Tạo appointment cũ #284, Admin xác nhận và Patient nhận notification cũ</w:t>
-            </w:r>
-          </w:p>
-        </w:tc>
-        <w:tc>
-          <w:tcPr>
-            <w:tcW w:type="dxa" w:w="1728"/>
-          </w:tcPr>
-          <w:p>
-            <w:r/>
-          </w:p>
-        </w:tc>
-      </w:tr>
-      <w:tr>
-        <w:tc>
-          <w:tcPr>
-            <w:tcW w:type="dxa" w:w="1728"/>
-          </w:tcPr>
-          <w:p>
-            <w:r>
-              <w:t>TC-NOTIFICATION-004</w:t>
-            </w:r>
-          </w:p>
-        </w:tc>
-        <w:tc>
-          <w:tcPr>
-            <w:tcW w:type="dxa" w:w="1728"/>
-          </w:tcPr>
-          <w:p>
-            <w:r>
-              <w:t>2</w:t>
-            </w:r>
-          </w:p>
-        </w:tc>
-        <w:tc>
-          <w:tcPr>
-            <w:tcW w:type="dxa" w:w="1728"/>
-          </w:tcPr>
-          <w:p>
-            <w:r>
-              <w:t>PASS</w:t>
-            </w:r>
-          </w:p>
-        </w:tc>
-        <w:tc>
-          <w:tcPr>
-            <w:tcW w:type="dxa" w:w="1728"/>
-          </w:tcPr>
-          <w:p>
-            <w:r>
-              <w:t>Patient tạo appointment mới #285, khác appointment cũ #284</w:t>
-            </w:r>
-          </w:p>
-        </w:tc>
-        <w:tc>
-          <w:tcPr>
-            <w:tcW w:type="dxa" w:w="1728"/>
-          </w:tcPr>
-          <w:p>
-            <w:r/>
-          </w:p>
-        </w:tc>
-      </w:tr>
-      <w:tr>
-        <w:tc>
-          <w:tcPr>
-            <w:tcW w:type="dxa" w:w="1728"/>
-          </w:tcPr>
-          <w:p>
-            <w:r>
-              <w:t>TC-NOTIFICATION-004</w:t>
-            </w:r>
-          </w:p>
-        </w:tc>
-        <w:tc>
-          <w:tcPr>
-            <w:tcW w:type="dxa" w:w="1728"/>
-          </w:tcPr>
-          <w:p>
-            <w:r>
-              <w:t>3</w:t>
-            </w:r>
-          </w:p>
-        </w:tc>
-        <w:tc>
-          <w:tcPr>
-            <w:tcW w:type="dxa" w:w="1728"/>
-          </w:tcPr>
-          <w:p>
-            <w:r>
-              <w:t>PASS</w:t>
-            </w:r>
-          </w:p>
-        </w:tc>
-        <w:tc>
-          <w:tcPr>
-            <w:tcW w:type="dxa" w:w="1728"/>
-          </w:tcPr>
-          <w:p>
-            <w:r>
-              <w:t>Admin xác nhận appointment mới #285 thành công</w:t>
-            </w:r>
-          </w:p>
-        </w:tc>
-        <w:tc>
-          <w:tcPr>
-            <w:tcW w:type="dxa" w:w="1728"/>
-          </w:tcPr>
-          <w:p>
-            <w:r/>
-          </w:p>
-        </w:tc>
-      </w:tr>
-      <w:tr>
-        <w:tc>
-          <w:tcPr>
-            <w:tcW w:type="dxa" w:w="1728"/>
-          </w:tcPr>
-          <w:p>
-            <w:r>
-              <w:t>TC-NOTIFICATION-004</w:t>
-            </w:r>
-          </w:p>
-        </w:tc>
-        <w:tc>
-          <w:tcPr>
-            <w:tcW w:type="dxa" w:w="1728"/>
-          </w:tcPr>
-          <w:p>
-            <w:r>
-              <w:t>4</w:t>
-            </w:r>
-          </w:p>
-        </w:tc>
-        <w:tc>
-          <w:tcPr>
-            <w:tcW w:type="dxa" w:w="1728"/>
-          </w:tcPr>
-          <w:p>
-            <w:r>
-              <w:t>PASS</w:t>
-            </w:r>
-          </w:p>
-        </w:tc>
-        <w:tc>
-          <w:tcPr>
-            <w:tcW w:type="dxa" w:w="1728"/>
-          </w:tcPr>
-          <w:p>
-            <w:r>
-              <w:t>Đăng xuất Admin và đăng nhập lại Patient thành công</w:t>
-            </w:r>
-          </w:p>
-        </w:tc>
-        <w:tc>
-          <w:tcPr>
-            <w:tcW w:type="dxa" w:w="1728"/>
-          </w:tcPr>
-          <w:p>
-            <w:r/>
-          </w:p>
-        </w:tc>
-      </w:tr>
-      <w:tr>
-        <w:tc>
-          <w:tcPr>
-            <w:tcW w:type="dxa" w:w="1728"/>
-          </w:tcPr>
-          <w:p>
-            <w:r>
-              <w:t>TC-NOTIFICATION-004</w:t>
-            </w:r>
-          </w:p>
-        </w:tc>
-        <w:tc>
-          <w:tcPr>
-            <w:tcW w:type="dxa" w:w="1728"/>
-          </w:tcPr>
-          <w:p>
-            <w:r>
-              <w:t>5</w:t>
-            </w:r>
-          </w:p>
-        </w:tc>
-        <w:tc>
-          <w:tcPr>
-            <w:tcW w:type="dxa" w:w="1728"/>
-          </w:tcPr>
-          <w:p>
-            <w:r>
-              <w:t>PASS</w:t>
-            </w:r>
-          </w:p>
-        </w:tc>
-        <w:tc>
-          <w:tcPr>
-            <w:tcW w:type="dxa" w:w="1728"/>
-          </w:tcPr>
-          <w:p>
-            <w:r>
-              <w:t>Patient mở trang Thông báo thành công</w:t>
-            </w:r>
-          </w:p>
-        </w:tc>
-        <w:tc>
-          <w:tcPr>
-            <w:tcW w:type="dxa" w:w="1728"/>
-          </w:tcPr>
-          <w:p>
-            <w:r/>
-          </w:p>
-        </w:tc>
-      </w:tr>
-      <w:tr>
-        <w:tc>
-          <w:tcPr>
-            <w:tcW w:type="dxa" w:w="1728"/>
-          </w:tcPr>
-          <w:p>
-            <w:r>
-              <w:t>TC-NOTIFICATION-004</w:t>
-            </w:r>
-          </w:p>
-        </w:tc>
-        <w:tc>
-          <w:tcPr>
-            <w:tcW w:type="dxa" w:w="1728"/>
-          </w:tcPr>
-          <w:p>
-            <w:r>
-              <w:t>6</w:t>
-            </w:r>
-          </w:p>
-        </w:tc>
-        <w:tc>
-          <w:tcPr>
-            <w:tcW w:type="dxa" w:w="1728"/>
-          </w:tcPr>
-          <w:p>
-            <w:r>
-              <w:t>PASS</w:t>
-            </w:r>
-          </w:p>
-        </w:tc>
-        <w:tc>
-          <w:tcPr>
-            <w:tcW w:type="dxa" w:w="1728"/>
-          </w:tcPr>
-          <w:p>
-            <w:r>
-              <w:t>Notification mới của appointment #285 hiển thị đúng</w:t>
-            </w:r>
-          </w:p>
-        </w:tc>
-        <w:tc>
-          <w:tcPr>
-            <w:tcW w:type="dxa" w:w="1728"/>
-          </w:tcPr>
-          <w:p>
-            <w:r/>
-          </w:p>
-        </w:tc>
-      </w:tr>
-      <w:tr>
-        <w:tc>
-          <w:tcPr>
-            <w:tcW w:type="dxa" w:w="1728"/>
-          </w:tcPr>
-          <w:p>
-            <w:r>
-              <w:t>TC-NOTIFICATION-004</w:t>
-            </w:r>
-          </w:p>
-        </w:tc>
-        <w:tc>
-          <w:tcPr>
-            <w:tcW w:type="dxa" w:w="1728"/>
-          </w:tcPr>
-          <w:p>
-            <w:r>
-              <w:t>7</w:t>
-            </w:r>
-          </w:p>
-        </w:tc>
-        <w:tc>
-          <w:tcPr>
-            <w:tcW w:type="dxa" w:w="1728"/>
-          </w:tcPr>
-          <w:p>
-            <w:r>
-              <w:t>PASS</w:t>
-            </w:r>
-          </w:p>
-        </w:tc>
-        <w:tc>
-          <w:tcPr>
-            <w:tcW w:type="dxa" w:w="1728"/>
-          </w:tcPr>
-          <w:p>
-            <w:r>
-              <w:t>Notification #284 và #285 được lưu độc lập, không ghi đè nhau</w:t>
-            </w:r>
-          </w:p>
-        </w:tc>
-        <w:tc>
-          <w:tcPr>
-            <w:tcW w:type="dxa" w:w="1728"/>
-          </w:tcPr>
-          <w:p>
-            <w:r/>
-          </w:p>
-        </w:tc>
-      </w:tr>
-      <w:tr>
-        <w:tc>
-          <w:tcPr>
-            <w:tcW w:type="dxa" w:w="1728"/>
-          </w:tcPr>
-          <w:p>
-            <w:r>
-              <w:t>TC-NOTIFICATION-005</w:t>
-            </w:r>
-          </w:p>
-        </w:tc>
-        <w:tc>
-          <w:tcPr>
-            <w:tcW w:type="dxa" w:w="1728"/>
-          </w:tcPr>
-          <w:p>
-            <w:r>
-              <w:t>1</w:t>
-            </w:r>
-          </w:p>
-        </w:tc>
-        <w:tc>
-          <w:tcPr>
-            <w:tcW w:type="dxa" w:w="1728"/>
-          </w:tcPr>
-          <w:p>
-            <w:r>
-              <w:t>PASS</w:t>
-            </w:r>
-          </w:p>
-        </w:tc>
-        <w:tc>
-          <w:tcPr>
-            <w:tcW w:type="dxa" w:w="1728"/>
-          </w:tcPr>
-          <w:p>
-            <w:r>
-              <w:t>Đăng nhập Patient A thành công</w:t>
-            </w:r>
-          </w:p>
-        </w:tc>
-        <w:tc>
-          <w:tcPr>
-            <w:tcW w:type="dxa" w:w="1728"/>
-          </w:tcPr>
-          <w:p>
-            <w:r/>
-          </w:p>
-        </w:tc>
-      </w:tr>
-      <w:tr>
-        <w:tc>
-          <w:tcPr>
-            <w:tcW w:type="dxa" w:w="1728"/>
-          </w:tcPr>
-          <w:p>
-            <w:r>
-              <w:t>TC-NOTIFICATION-005</w:t>
-            </w:r>
-          </w:p>
-        </w:tc>
-        <w:tc>
-          <w:tcPr>
-            <w:tcW w:type="dxa" w:w="1728"/>
-          </w:tcPr>
-          <w:p>
-            <w:r>
-              <w:t>2</w:t>
-            </w:r>
-          </w:p>
-        </w:tc>
-        <w:tc>
-          <w:tcPr>
-            <w:tcW w:type="dxa" w:w="1728"/>
-          </w:tcPr>
-          <w:p>
-            <w:r>
-              <w:t>PASS</w:t>
-            </w:r>
-          </w:p>
-        </w:tc>
-        <w:tc>
-          <w:tcPr>
-            <w:tcW w:type="dxa" w:w="1728"/>
-          </w:tcPr>
-          <w:p>
-            <w:r>
-              <w:t>Patient A có 239 notification</w:t>
-            </w:r>
-          </w:p>
-        </w:tc>
-        <w:tc>
-          <w:tcPr>
-            <w:tcW w:type="dxa" w:w="1728"/>
-          </w:tcPr>
-          <w:p>
-            <w:r/>
-          </w:p>
-        </w:tc>
-      </w:tr>
-      <w:tr>
-        <w:tc>
-          <w:tcPr>
-            <w:tcW w:type="dxa" w:w="1728"/>
-          </w:tcPr>
-          <w:p>
-            <w:r>
-              <w:t>TC-NOTIFICATION-005</w:t>
-            </w:r>
-          </w:p>
-        </w:tc>
-        <w:tc>
-          <w:tcPr>
-            <w:tcW w:type="dxa" w:w="1728"/>
-          </w:tcPr>
-          <w:p>
-            <w:r>
-              <w:t>3</w:t>
-            </w:r>
-          </w:p>
-        </w:tc>
-        <w:tc>
-          <w:tcPr>
-            <w:tcW w:type="dxa" w:w="1728"/>
-          </w:tcPr>
-          <w:p>
-            <w:r>
-              <w:t>PASS</w:t>
-            </w:r>
-          </w:p>
-        </w:tc>
-        <w:tc>
-          <w:tcPr>
-            <w:tcW w:type="dxa" w:w="1728"/>
-          </w:tcPr>
-          <w:p>
-            <w:r>
-              <w:t>Đăng xuất Patient A và đăng nhập Patient B thành công</w:t>
-            </w:r>
-          </w:p>
-        </w:tc>
-        <w:tc>
-          <w:tcPr>
-            <w:tcW w:type="dxa" w:w="1728"/>
-          </w:tcPr>
-          <w:p>
-            <w:r/>
-          </w:p>
-        </w:tc>
-      </w:tr>
-      <w:tr>
-        <w:tc>
-          <w:tcPr>
-            <w:tcW w:type="dxa" w:w="1728"/>
-          </w:tcPr>
-          <w:p>
-            <w:r>
-              <w:t>TC-NOTIFICATION-005</w:t>
-            </w:r>
-          </w:p>
-        </w:tc>
-        <w:tc>
-          <w:tcPr>
-            <w:tcW w:type="dxa" w:w="1728"/>
-          </w:tcPr>
-          <w:p>
-            <w:r>
-              <w:t>4</w:t>
-            </w:r>
-          </w:p>
-        </w:tc>
-        <w:tc>
-          <w:tcPr>
-            <w:tcW w:type="dxa" w:w="1728"/>
-          </w:tcPr>
-          <w:p>
-            <w:r>
-              <w:t>PASS</w:t>
-            </w:r>
-          </w:p>
-        </w:tc>
-        <w:tc>
-          <w:tcPr>
-            <w:tcW w:type="dxa" w:w="1728"/>
-          </w:tcPr>
-          <w:p>
-            <w:r>
-              <w:t>Patient B có 15 notification</w:t>
-            </w:r>
-          </w:p>
-        </w:tc>
-        <w:tc>
-          <w:tcPr>
-            <w:tcW w:type="dxa" w:w="1728"/>
-          </w:tcPr>
-          <w:p>
-            <w:r/>
-          </w:p>
-        </w:tc>
-      </w:tr>
-      <w:tr>
-        <w:tc>
-          <w:tcPr>
-            <w:tcW w:type="dxa" w:w="1728"/>
-          </w:tcPr>
-          <w:p>
-            <w:r>
-              <w:t>TC-NOTIFICATION-005</w:t>
-            </w:r>
-          </w:p>
-        </w:tc>
-        <w:tc>
-          <w:tcPr>
-            <w:tcW w:type="dxa" w:w="1728"/>
-          </w:tcPr>
-          <w:p>
-            <w:r>
-              <w:t>5</w:t>
-            </w:r>
-          </w:p>
-        </w:tc>
-        <w:tc>
-          <w:tcPr>
-            <w:tcW w:type="dxa" w:w="1728"/>
-          </w:tcPr>
-          <w:p>
-            <w:r>
-              <w:t>PASS</w:t>
-            </w:r>
-          </w:p>
-        </w:tc>
-        <w:tc>
-          <w:tcPr>
-            <w:tcW w:type="dxa" w:w="1728"/>
-          </w:tcPr>
-          <w:p>
-            <w:r>
-              <w:t>Danh sách notification của Patient A và Patient B được phân tách, không giống nhau</w:t>
-            </w:r>
-          </w:p>
-        </w:tc>
-        <w:tc>
-          <w:tcPr>
-            <w:tcW w:type="dxa" w:w="1728"/>
-          </w:tcPr>
-          <w:p>
-            <w:r/>
-          </w:p>
-        </w:tc>
-      </w:tr>
-      <w:tr>
-        <w:tc>
-          <w:tcPr>
-            <w:tcW w:type="dxa" w:w="1728"/>
-          </w:tcPr>
-          <w:p>
-            <w:r>
-              <w:t>TC-NOTIFICATION-006</w:t>
-            </w:r>
-          </w:p>
-        </w:tc>
-        <w:tc>
-          <w:tcPr>
-            <w:tcW w:type="dxa" w:w="1728"/>
-          </w:tcPr>
-          <w:p>
-            <w:r>
-              <w:t>1</w:t>
-            </w:r>
-          </w:p>
-        </w:tc>
-        <w:tc>
-          <w:tcPr>
-            <w:tcW w:type="dxa" w:w="1728"/>
-          </w:tcPr>
-          <w:p>
-            <w:r>
-              <w:t>PASS</w:t>
-            </w:r>
-          </w:p>
-        </w:tc>
-        <w:tc>
-          <w:tcPr>
-            <w:tcW w:type="dxa" w:w="1728"/>
-          </w:tcPr>
-          <w:p>
-            <w:r>
-              <w:t>Chuẩn bị appointment #286 và Admin xác nhận lịch thành công</w:t>
-            </w:r>
-          </w:p>
-        </w:tc>
-        <w:tc>
-          <w:tcPr>
-            <w:tcW w:type="dxa" w:w="1728"/>
-          </w:tcPr>
-          <w:p>
-            <w:r/>
-          </w:p>
-        </w:tc>
-      </w:tr>
-      <w:tr>
-        <w:tc>
-          <w:tcPr>
-            <w:tcW w:type="dxa" w:w="1728"/>
-          </w:tcPr>
-          <w:p>
-            <w:r>
-              <w:t>TC-NOTIFICATION-006</w:t>
-            </w:r>
-          </w:p>
-        </w:tc>
-        <w:tc>
-          <w:tcPr>
-            <w:tcW w:type="dxa" w:w="1728"/>
-          </w:tcPr>
-          <w:p>
-            <w:r>
-              <w:t>2</w:t>
-            </w:r>
-          </w:p>
-        </w:tc>
-        <w:tc>
-          <w:tcPr>
-            <w:tcW w:type="dxa" w:w="1728"/>
-          </w:tcPr>
-          <w:p>
-            <w:r>
-              <w:t>PASS</w:t>
-            </w:r>
-          </w:p>
-        </w:tc>
-        <w:tc>
-          <w:tcPr>
-            <w:tcW w:type="dxa" w:w="1728"/>
-          </w:tcPr>
-          <w:p>
-            <w:r>
-              <w:t>Đăng nhập Doctor thành công</w:t>
-            </w:r>
-          </w:p>
-        </w:tc>
-        <w:tc>
-          <w:tcPr>
-            <w:tcW w:type="dxa" w:w="1728"/>
-          </w:tcPr>
-          <w:p>
-            <w:r/>
-          </w:p>
-        </w:tc>
-      </w:tr>
-      <w:tr>
-        <w:tc>
-          <w:tcPr>
-            <w:tcW w:type="dxa" w:w="1728"/>
-          </w:tcPr>
-          <w:p>
-            <w:r>
-              <w:t>TC-NOTIFICATION-006</w:t>
-            </w:r>
-          </w:p>
-        </w:tc>
-        <w:tc>
-          <w:tcPr>
-            <w:tcW w:type="dxa" w:w="1728"/>
-          </w:tcPr>
-          <w:p>
-            <w:r>
-              <w:t>3</w:t>
-            </w:r>
-          </w:p>
-        </w:tc>
-        <w:tc>
-          <w:tcPr>
-            <w:tcW w:type="dxa" w:w="1728"/>
-          </w:tcPr>
-          <w:p>
-            <w:r>
-              <w:t>PASS</w:t>
-            </w:r>
-          </w:p>
-        </w:tc>
-        <w:tc>
-          <w:tcPr>
-            <w:tcW w:type="dxa" w:w="1728"/>
-          </w:tcPr>
-          <w:p>
-            <w:r>
-              <w:t>Doctor mở appointment #286 và vào màn hình Khám bệnh thành công</w:t>
-            </w:r>
-          </w:p>
-        </w:tc>
-        <w:tc>
-          <w:tcPr>
-            <w:tcW w:type="dxa" w:w="1728"/>
-          </w:tcPr>
-          <w:p>
-            <w:r/>
-          </w:p>
-        </w:tc>
-      </w:tr>
-      <w:tr>
-        <w:tc>
-          <w:tcPr>
-            <w:tcW w:type="dxa" w:w="1728"/>
-          </w:tcPr>
-          <w:p>
-            <w:r>
-              <w:t>TC-NOTIFICATION-006</w:t>
-            </w:r>
-          </w:p>
-        </w:tc>
-        <w:tc>
-          <w:tcPr>
-            <w:tcW w:type="dxa" w:w="1728"/>
-          </w:tcPr>
-          <w:p>
-            <w:r>
-              <w:t>4</w:t>
-            </w:r>
-          </w:p>
-        </w:tc>
-        <w:tc>
-          <w:tcPr>
-            <w:tcW w:type="dxa" w:w="1728"/>
-          </w:tcPr>
-          <w:p>
-            <w:r>
-              <w:t>PASS</w:t>
-            </w:r>
-          </w:p>
-        </w:tc>
-        <w:tc>
-          <w:tcPr>
-            <w:tcW w:type="dxa" w:w="1728"/>
-          </w:tcPr>
-          <w:p>
-            <w:r>
-              <w:t>Doctor nhập Chẩn đoán và Hướng điều trị hợp lệ</w:t>
-            </w:r>
-          </w:p>
-        </w:tc>
-        <w:tc>
-          <w:tcPr>
-            <w:tcW w:type="dxa" w:w="1728"/>
-          </w:tcPr>
-          <w:p>
-            <w:r/>
-          </w:p>
-        </w:tc>
-      </w:tr>
-      <w:tr>
-        <w:tc>
-          <w:tcPr>
-            <w:tcW w:type="dxa" w:w="1728"/>
-          </w:tcPr>
-          <w:p>
-            <w:r>
-              <w:t>TC-NOTIFICATION-006</w:t>
-            </w:r>
-          </w:p>
-        </w:tc>
-        <w:tc>
-          <w:tcPr>
-            <w:tcW w:type="dxa" w:w="1728"/>
-          </w:tcPr>
-          <w:p>
-            <w:r>
-              <w:t>5</w:t>
-            </w:r>
-          </w:p>
-        </w:tc>
-        <w:tc>
-          <w:tcPr>
-            <w:tcW w:type="dxa" w:w="1728"/>
-          </w:tcPr>
-          <w:p>
-            <w:r>
-              <w:t>PASS</w:t>
-            </w:r>
-          </w:p>
-        </w:tc>
-        <w:tc>
-          <w:tcPr>
-            <w:tcW w:type="dxa" w:w="1728"/>
-          </w:tcPr>
-          <w:p>
-            <w:r>
-              <w:t>Doctor lưu hồ sơ bệnh án thành công</w:t>
-            </w:r>
-          </w:p>
-        </w:tc>
-        <w:tc>
-          <w:tcPr>
-            <w:tcW w:type="dxa" w:w="1728"/>
-          </w:tcPr>
-          <w:p>
-            <w:r/>
-          </w:p>
-        </w:tc>
-      </w:tr>
-      <w:tr>
-        <w:tc>
-          <w:tcPr>
-            <w:tcW w:type="dxa" w:w="1728"/>
-          </w:tcPr>
-          <w:p>
-            <w:r>
-              <w:t>TC-NOTIFICATION-006</w:t>
-            </w:r>
-          </w:p>
-        </w:tc>
-        <w:tc>
-          <w:tcPr>
-            <w:tcW w:type="dxa" w:w="1728"/>
-          </w:tcPr>
-          <w:p>
-            <w:r>
-              <w:t>6</w:t>
-            </w:r>
-          </w:p>
-        </w:tc>
-        <w:tc>
-          <w:tcPr>
-            <w:tcW w:type="dxa" w:w="1728"/>
-          </w:tcPr>
-          <w:p>
-            <w:r>
-              <w:t>PASS</w:t>
-            </w:r>
-          </w:p>
-        </w:tc>
-        <w:tc>
-          <w:tcPr>
-            <w:tcW w:type="dxa" w:w="1728"/>
-          </w:tcPr>
-          <w:p>
-            <w:r>
-              <w:t>Doctor mở form kê đơn thuốc thành công</w:t>
-            </w:r>
-          </w:p>
-        </w:tc>
-        <w:tc>
-          <w:tcPr>
-            <w:tcW w:type="dxa" w:w="1728"/>
-          </w:tcPr>
-          <w:p>
-            <w:r/>
-          </w:p>
-        </w:tc>
-      </w:tr>
-      <w:tr>
-        <w:tc>
-          <w:tcPr>
-            <w:tcW w:type="dxa" w:w="1728"/>
-          </w:tcPr>
-          <w:p>
-            <w:r>
-              <w:t>TC-NOTIFICATION-006</w:t>
-            </w:r>
-          </w:p>
-        </w:tc>
-        <w:tc>
-          <w:tcPr>
-            <w:tcW w:type="dxa" w:w="1728"/>
-          </w:tcPr>
-          <w:p>
-            <w:r>
-              <w:t>7</w:t>
-            </w:r>
-          </w:p>
-        </w:tc>
-        <w:tc>
-          <w:tcPr>
-            <w:tcW w:type="dxa" w:w="1728"/>
-          </w:tcPr>
-          <w:p>
-            <w:r>
-              <w:t>PASS</w:t>
-            </w:r>
-          </w:p>
-        </w:tc>
-        <w:tc>
-          <w:tcPr>
-            <w:tcW w:type="dxa" w:w="1728"/>
-          </w:tcPr>
-          <w:p>
-            <w:r>
-              <w:t>Doctor tạo và lưu đơn thuốc với thuốc 'kiểm tra ngày - tồn kho: 75 viên' thành công</w:t>
-            </w:r>
-          </w:p>
-        </w:tc>
-        <w:tc>
-          <w:tcPr>
-            <w:tcW w:type="dxa" w:w="1728"/>
-          </w:tcPr>
-          <w:p>
-            <w:r/>
-          </w:p>
-        </w:tc>
-      </w:tr>
-      <w:tr>
-        <w:tc>
-          <w:tcPr>
-            <w:tcW w:type="dxa" w:w="1728"/>
-          </w:tcPr>
-          <w:p>
-            <w:r>
-              <w:t>TC-NOTIFICATION-006</w:t>
-            </w:r>
-          </w:p>
-        </w:tc>
-        <w:tc>
-          <w:tcPr>
-            <w:tcW w:type="dxa" w:w="1728"/>
-          </w:tcPr>
-          <w:p>
-            <w:r>
-              <w:t>8</w:t>
-            </w:r>
-          </w:p>
-        </w:tc>
-        <w:tc>
-          <w:tcPr>
-            <w:tcW w:type="dxa" w:w="1728"/>
-          </w:tcPr>
-          <w:p>
-            <w:r>
-              <w:t>PASS</w:t>
-            </w:r>
-          </w:p>
-        </w:tc>
-        <w:tc>
-          <w:tcPr>
-            <w:tcW w:type="dxa" w:w="1728"/>
-          </w:tcPr>
-          <w:p>
-            <w:r>
-              <w:t>Đăng xuất Doctor và đăng nhập lại Patient thành công</w:t>
-            </w:r>
-          </w:p>
-        </w:tc>
-        <w:tc>
-          <w:tcPr>
-            <w:tcW w:type="dxa" w:w="1728"/>
-          </w:tcPr>
-          <w:p>
-            <w:r/>
-          </w:p>
-        </w:tc>
-      </w:tr>
-      <w:tr>
-        <w:tc>
-          <w:tcPr>
-            <w:tcW w:type="dxa" w:w="1728"/>
-          </w:tcPr>
-          <w:p>
-            <w:r>
-              <w:t>TC-NOTIFICATION-006</w:t>
-            </w:r>
-          </w:p>
-        </w:tc>
-        <w:tc>
-          <w:tcPr>
-            <w:tcW w:type="dxa" w:w="1728"/>
-          </w:tcPr>
-          <w:p>
-            <w:r>
-              <w:t>9</w:t>
-            </w:r>
-          </w:p>
-        </w:tc>
-        <w:tc>
-          <w:tcPr>
-            <w:tcW w:type="dxa" w:w="1728"/>
-          </w:tcPr>
-          <w:p>
-            <w:r>
-              <w:t>PASS</w:t>
-            </w:r>
-          </w:p>
-        </w:tc>
-        <w:tc>
-          <w:tcPr>
-            <w:tcW w:type="dxa" w:w="1728"/>
-          </w:tcPr>
-          <w:p>
-            <w:r>
-              <w:t>Patient nhận notification đơn thuốc đúng loại, đúng nội dung và đúng định dạng thời gian</w:t>
-            </w:r>
-          </w:p>
-        </w:tc>
-        <w:tc>
-          <w:tcPr>
-            <w:tcW w:type="dxa" w:w="1728"/>
-          </w:tcPr>
-          <w:p>
-            <w:r/>
-          </w:p>
-        </w:tc>
-      </w:tr>
-      <w:tr>
-        <w:tc>
-          <w:tcPr>
-            <w:tcW w:type="dxa" w:w="1728"/>
-          </w:tcPr>
-          <w:p>
-            <w:r>
-              <w:t>TC-NOTIFICATION-007</w:t>
-            </w:r>
-          </w:p>
-        </w:tc>
-        <w:tc>
-          <w:tcPr>
-            <w:tcW w:type="dxa" w:w="1728"/>
-          </w:tcPr>
-          <w:p>
-            <w:r>
-              <w:t>1</w:t>
-            </w:r>
-          </w:p>
-        </w:tc>
-        <w:tc>
-          <w:tcPr>
-            <w:tcW w:type="dxa" w:w="1728"/>
-          </w:tcPr>
-          <w:p>
-            <w:r>
-              <w:t>PASS</w:t>
-            </w:r>
-          </w:p>
-        </w:tc>
-        <w:tc>
-          <w:tcPr>
-            <w:tcW w:type="dxa" w:w="1728"/>
-          </w:tcPr>
-          <w:p>
-            <w:r>
-              <w:t>Chuẩn bị appointment #287, Admin xác nhận và Doctor tạo hồ sơ bệnh án thành công</w:t>
-            </w:r>
-          </w:p>
-        </w:tc>
-        <w:tc>
-          <w:tcPr>
-            <w:tcW w:type="dxa" w:w="1728"/>
-          </w:tcPr>
-          <w:p>
-            <w:r/>
-          </w:p>
-        </w:tc>
-      </w:tr>
-      <w:tr>
-        <w:tc>
-          <w:tcPr>
-            <w:tcW w:type="dxa" w:w="1728"/>
-          </w:tcPr>
-          <w:p>
-            <w:r>
-              <w:t>TC-NOTIFICATION-007</w:t>
-            </w:r>
-          </w:p>
-        </w:tc>
-        <w:tc>
-          <w:tcPr>
-            <w:tcW w:type="dxa" w:w="1728"/>
-          </w:tcPr>
-          <w:p>
-            <w:r>
-              <w:t>2</w:t>
-            </w:r>
-          </w:p>
-        </w:tc>
-        <w:tc>
-          <w:tcPr>
-            <w:tcW w:type="dxa" w:w="1728"/>
-          </w:tcPr>
-          <w:p>
-            <w:r>
-              <w:t>PASS</w:t>
-            </w:r>
-          </w:p>
-        </w:tc>
-        <w:tc>
-          <w:tcPr>
-            <w:tcW w:type="dxa" w:w="1728"/>
-          </w:tcPr>
-          <w:p>
-            <w:r>
-              <w:t>Doctor đang đăng nhập và truy cập được hồ sơ bệnh án</w:t>
-            </w:r>
-          </w:p>
-        </w:tc>
-        <w:tc>
-          <w:tcPr>
-            <w:tcW w:type="dxa" w:w="1728"/>
-          </w:tcPr>
-          <w:p>
-            <w:r/>
-          </w:p>
-        </w:tc>
-      </w:tr>
-      <w:tr>
-        <w:tc>
-          <w:tcPr>
-            <w:tcW w:type="dxa" w:w="1728"/>
-          </w:tcPr>
-          <w:p>
-            <w:r>
-              <w:t>TC-NOTIFICATION-007</w:t>
-            </w:r>
-          </w:p>
-        </w:tc>
-        <w:tc>
-          <w:tcPr>
-            <w:tcW w:type="dxa" w:w="1728"/>
-          </w:tcPr>
-          <w:p>
-            <w:r>
-              <w:t>3</w:t>
-            </w:r>
-          </w:p>
-        </w:tc>
-        <w:tc>
-          <w:tcPr>
-            <w:tcW w:type="dxa" w:w="1728"/>
-          </w:tcPr>
-          <w:p>
-            <w:r>
-              <w:t>PASS</w:t>
-            </w:r>
-          </w:p>
-        </w:tc>
-        <w:tc>
-          <w:tcPr>
-            <w:tcW w:type="dxa" w:w="1728"/>
-          </w:tcPr>
-          <w:p>
-            <w:r>
-              <w:t>Mở hồ sơ bệnh án của appointment #287 thành công</w:t>
-            </w:r>
-          </w:p>
-        </w:tc>
-        <w:tc>
-          <w:tcPr>
-            <w:tcW w:type="dxa" w:w="1728"/>
-          </w:tcPr>
-          <w:p>
-            <w:r/>
-          </w:p>
-        </w:tc>
-      </w:tr>
-      <w:tr>
-        <w:tc>
-          <w:tcPr>
-            <w:tcW w:type="dxa" w:w="1728"/>
-          </w:tcPr>
-          <w:p>
-            <w:r>
-              <w:t>TC-NOTIFICATION-007</w:t>
-            </w:r>
-          </w:p>
-        </w:tc>
-        <w:tc>
-          <w:tcPr>
-            <w:tcW w:type="dxa" w:w="1728"/>
-          </w:tcPr>
-          <w:p>
-            <w:r>
-              <w:t>4</w:t>
-            </w:r>
-          </w:p>
-        </w:tc>
-        <w:tc>
-          <w:tcPr>
-            <w:tcW w:type="dxa" w:w="1728"/>
-          </w:tcPr>
-          <w:p>
-            <w:r>
-              <w:t>PASS</w:t>
-            </w:r>
-          </w:p>
-        </w:tc>
-        <w:tc>
-          <w:tcPr>
-            <w:tcW w:type="dxa" w:w="1728"/>
-          </w:tcPr>
-          <w:p>
-            <w:r>
-              <w:t>Mở phần Xét nghiệm thành công</w:t>
-            </w:r>
-          </w:p>
-        </w:tc>
-        <w:tc>
-          <w:tcPr>
-            <w:tcW w:type="dxa" w:w="1728"/>
-          </w:tcPr>
-          <w:p>
-            <w:r/>
-          </w:p>
-        </w:tc>
-      </w:tr>
-      <w:tr>
-        <w:tc>
-          <w:tcPr>
-            <w:tcW w:type="dxa" w:w="1728"/>
-          </w:tcPr>
-          <w:p>
-            <w:r>
-              <w:t>TC-NOTIFICATION-007</w:t>
-            </w:r>
-          </w:p>
-        </w:tc>
-        <w:tc>
-          <w:tcPr>
-            <w:tcW w:type="dxa" w:w="1728"/>
-          </w:tcPr>
-          <w:p>
-            <w:r>
-              <w:t>5</w:t>
-            </w:r>
-          </w:p>
-        </w:tc>
-        <w:tc>
-          <w:tcPr>
-            <w:tcW w:type="dxa" w:w="1728"/>
-          </w:tcPr>
-          <w:p>
-            <w:r>
-              <w:t>PASS</w:t>
-            </w:r>
-          </w:p>
-        </w:tc>
-        <w:tc>
-          <w:tcPr>
-            <w:tcW w:type="dxa" w:w="1728"/>
-          </w:tcPr>
-          <w:p>
-            <w:r>
-              <w:t>Nhập xét nghiệm 'Xet nghiem mau TC-NOTIFICATION-007-1787822470' và kết quả hợp lệ</w:t>
-            </w:r>
-          </w:p>
-        </w:tc>
-        <w:tc>
-          <w:tcPr>
-            <w:tcW w:type="dxa" w:w="1728"/>
-          </w:tcPr>
-          <w:p>
-            <w:r/>
-          </w:p>
-        </w:tc>
-      </w:tr>
-      <w:tr>
-        <w:tc>
-          <w:tcPr>
-            <w:tcW w:type="dxa" w:w="1728"/>
-          </w:tcPr>
-          <w:p>
-            <w:r>
-              <w:t>TC-NOTIFICATION-007</w:t>
-            </w:r>
-          </w:p>
-        </w:tc>
-        <w:tc>
-          <w:tcPr>
-            <w:tcW w:type="dxa" w:w="1728"/>
-          </w:tcPr>
-          <w:p>
-            <w:r>
-              <w:t>6</w:t>
-            </w:r>
-          </w:p>
-        </w:tc>
-        <w:tc>
-          <w:tcPr>
-            <w:tcW w:type="dxa" w:w="1728"/>
-          </w:tcPr>
-          <w:p>
-            <w:r>
-              <w:t>PASS</w:t>
-            </w:r>
-          </w:p>
-        </w:tc>
-        <w:tc>
-          <w:tcPr>
-            <w:tcW w:type="dxa" w:w="1728"/>
-          </w:tcPr>
-          <w:p>
-            <w:r>
-              <w:t>Lưu kết quả xét nghiệm 'Xet nghiem mau TC-NOTIFICATION-007-1787822470' thành công</w:t>
-            </w:r>
-          </w:p>
-        </w:tc>
-        <w:tc>
-          <w:tcPr>
-            <w:tcW w:type="dxa" w:w="1728"/>
-          </w:tcPr>
-          <w:p>
-            <w:r/>
-          </w:p>
-        </w:tc>
-      </w:tr>
-      <w:tr>
-        <w:tc>
-          <w:tcPr>
-            <w:tcW w:type="dxa" w:w="1728"/>
-          </w:tcPr>
-          <w:p>
-            <w:r>
-              <w:t>TC-NOTIFICATION-007</w:t>
-            </w:r>
-          </w:p>
-        </w:tc>
-        <w:tc>
-          <w:tcPr>
-            <w:tcW w:type="dxa" w:w="1728"/>
-          </w:tcPr>
-          <w:p>
-            <w:r>
-              <w:t>7</w:t>
-            </w:r>
-          </w:p>
-        </w:tc>
-        <w:tc>
-          <w:tcPr>
-            <w:tcW w:type="dxa" w:w="1728"/>
-          </w:tcPr>
-          <w:p>
-            <w:r>
-              <w:t>PASS</w:t>
-            </w:r>
-          </w:p>
-        </w:tc>
-        <w:tc>
-          <w:tcPr>
-            <w:tcW w:type="dxa" w:w="1728"/>
-          </w:tcPr>
-          <w:p>
-            <w:r>
-              <w:t>Đăng xuất Doctor và đăng nhập lại Patient thành công</w:t>
-            </w:r>
-          </w:p>
-        </w:tc>
-        <w:tc>
-          <w:tcPr>
-            <w:tcW w:type="dxa" w:w="1728"/>
-          </w:tcPr>
-          <w:p>
-            <w:r/>
-          </w:p>
-        </w:tc>
-      </w:tr>
-      <w:tr>
-        <w:tc>
-          <w:tcPr>
-            <w:tcW w:type="dxa" w:w="1728"/>
-          </w:tcPr>
-          <w:p>
-            <w:r>
-              <w:t>TC-NOTIFICATION-007</w:t>
-            </w:r>
-          </w:p>
-        </w:tc>
-        <w:tc>
-          <w:tcPr>
-            <w:tcW w:type="dxa" w:w="1728"/>
-          </w:tcPr>
-          <w:p>
-            <w:r>
-              <w:t>8</w:t>
-            </w:r>
-          </w:p>
-        </w:tc>
-        <w:tc>
-          <w:tcPr>
-            <w:tcW w:type="dxa" w:w="1728"/>
-          </w:tcPr>
-          <w:p>
-            <w:r>
-              <w:t>PASS</w:t>
-            </w:r>
-          </w:p>
-        </w:tc>
-        <w:tc>
-          <w:tcPr>
-            <w:tcW w:type="dxa" w:w="1728"/>
-          </w:tcPr>
-          <w:p>
-            <w:r>
-              <w:t>Patient mở trang Thông báo thành công</w:t>
-            </w:r>
-          </w:p>
-        </w:tc>
-        <w:tc>
-          <w:tcPr>
-            <w:tcW w:type="dxa" w:w="1728"/>
-          </w:tcPr>
-          <w:p>
-            <w:r/>
-          </w:p>
-        </w:tc>
-      </w:tr>
-      <w:tr>
-        <w:tc>
-          <w:tcPr>
-            <w:tcW w:type="dxa" w:w="1728"/>
-          </w:tcPr>
-          <w:p>
-            <w:r>
-              <w:t>TC-NOTIFICATION-007</w:t>
-            </w:r>
-          </w:p>
-        </w:tc>
-        <w:tc>
-          <w:tcPr>
-            <w:tcW w:type="dxa" w:w="1728"/>
-          </w:tcPr>
-          <w:p>
-            <w:r>
-              <w:t>9</w:t>
-            </w:r>
-          </w:p>
-        </w:tc>
-        <w:tc>
-          <w:tcPr>
-            <w:tcW w:type="dxa" w:w="1728"/>
-          </w:tcPr>
-          <w:p>
-            <w:r>
-              <w:t>PASS</w:t>
-            </w:r>
-          </w:p>
-        </w:tc>
-        <w:tc>
-          <w:tcPr>
-            <w:tcW w:type="dxa" w:w="1728"/>
-          </w:tcPr>
-          <w:p>
-            <w:r>
-              <w:t>Patient nhận notification cho xét nghiệm 'Xet nghiem mau TC-NOTIFICATION-007-1787822470' đúng loại, nội dung và thời gian</w:t>
-            </w:r>
-          </w:p>
-        </w:tc>
-        <w:tc>
-          <w:tcPr>
-            <w:tcW w:type="dxa" w:w="1728"/>
-          </w:tcPr>
-          <w:p>
-            <w:r/>
-          </w:p>
-        </w:tc>
-      </w:tr>
-      <w:tr>
-        <w:tc>
-          <w:tcPr>
-            <w:tcW w:type="dxa" w:w="1728"/>
-          </w:tcPr>
-          <w:p>
-            <w:r>
-              <w:t>TC-NOTIFICATION-008</w:t>
-            </w:r>
-          </w:p>
-        </w:tc>
-        <w:tc>
-          <w:tcPr>
-            <w:tcW w:type="dxa" w:w="1728"/>
-          </w:tcPr>
-          <w:p>
-            <w:r>
-              <w:t>1</w:t>
-            </w:r>
-          </w:p>
-        </w:tc>
-        <w:tc>
-          <w:tcPr>
-            <w:tcW w:type="dxa" w:w="1728"/>
-          </w:tcPr>
-          <w:p>
-            <w:r>
-              <w:t>PASS</w:t>
-            </w:r>
-          </w:p>
-        </w:tc>
-        <w:tc>
-          <w:tcPr>
-            <w:tcW w:type="dxa" w:w="1728"/>
-          </w:tcPr>
-          <w:p>
-            <w:r>
-              <w:t>Chuẩn bị appointment #288, hồ sơ bệnh án và đơn thuốc thứ nhất thành công</w:t>
-            </w:r>
-          </w:p>
-        </w:tc>
-        <w:tc>
-          <w:tcPr>
-            <w:tcW w:type="dxa" w:w="1728"/>
-          </w:tcPr>
-          <w:p>
-            <w:r/>
-          </w:p>
-        </w:tc>
-      </w:tr>
-      <w:tr>
-        <w:tc>
-          <w:tcPr>
-            <w:tcW w:type="dxa" w:w="1728"/>
-          </w:tcPr>
-          <w:p>
-            <w:r>
-              <w:t>TC-NOTIFICATION-008</w:t>
-            </w:r>
-          </w:p>
-        </w:tc>
-        <w:tc>
-          <w:tcPr>
-            <w:tcW w:type="dxa" w:w="1728"/>
-          </w:tcPr>
-          <w:p>
-            <w:r>
-              <w:t>2</w:t>
-            </w:r>
-          </w:p>
-        </w:tc>
-        <w:tc>
-          <w:tcPr>
-            <w:tcW w:type="dxa" w:w="1728"/>
-          </w:tcPr>
-          <w:p>
-            <w:r>
-              <w:t>PASS</w:t>
-            </w:r>
-          </w:p>
-        </w:tc>
-        <w:tc>
-          <w:tcPr>
-            <w:tcW w:type="dxa" w:w="1728"/>
-          </w:tcPr>
-          <w:p>
-            <w:r>
-              <w:t>Ghi nhận notification của đơn thuốc thứ nhất thành công</w:t>
-            </w:r>
-          </w:p>
-        </w:tc>
-        <w:tc>
-          <w:tcPr>
-            <w:tcW w:type="dxa" w:w="1728"/>
-          </w:tcPr>
-          <w:p>
-            <w:r/>
-          </w:p>
-        </w:tc>
-      </w:tr>
-      <w:tr>
-        <w:tc>
-          <w:tcPr>
-            <w:tcW w:type="dxa" w:w="1728"/>
-          </w:tcPr>
-          <w:p>
-            <w:r>
-              <w:t>TC-NOTIFICATION-008</w:t>
-            </w:r>
-          </w:p>
-        </w:tc>
-        <w:tc>
-          <w:tcPr>
-            <w:tcW w:type="dxa" w:w="1728"/>
-          </w:tcPr>
-          <w:p>
-            <w:r>
-              <w:t>3</w:t>
-            </w:r>
-          </w:p>
-        </w:tc>
-        <w:tc>
-          <w:tcPr>
-            <w:tcW w:type="dxa" w:w="1728"/>
-          </w:tcPr>
-          <w:p>
-            <w:r>
-              <w:t>PASS</w:t>
-            </w:r>
-          </w:p>
-        </w:tc>
-        <w:tc>
-          <w:tcPr>
-            <w:tcW w:type="dxa" w:w="1728"/>
-          </w:tcPr>
-          <w:p>
-            <w:r>
-              <w:t>Đăng nhập lại Doctor thành công</w:t>
-            </w:r>
-          </w:p>
-        </w:tc>
-        <w:tc>
-          <w:tcPr>
-            <w:tcW w:type="dxa" w:w="1728"/>
-          </w:tcPr>
-          <w:p>
-            <w:r/>
-          </w:p>
-        </w:tc>
-      </w:tr>
-      <w:tr>
-        <w:tc>
-          <w:tcPr>
-            <w:tcW w:type="dxa" w:w="1728"/>
-          </w:tcPr>
-          <w:p>
-            <w:r>
-              <w:t>TC-NOTIFICATION-008</w:t>
-            </w:r>
-          </w:p>
-        </w:tc>
-        <w:tc>
-          <w:tcPr>
-            <w:tcW w:type="dxa" w:w="1728"/>
-          </w:tcPr>
-          <w:p>
-            <w:r>
-              <w:t>4</w:t>
-            </w:r>
-          </w:p>
-        </w:tc>
-        <w:tc>
-          <w:tcPr>
-            <w:tcW w:type="dxa" w:w="1728"/>
-          </w:tcPr>
-          <w:p>
-            <w:r>
-              <w:t>PASS</w:t>
-            </w:r>
-          </w:p>
-        </w:tc>
-        <w:tc>
-          <w:tcPr>
-            <w:tcW w:type="dxa" w:w="1728"/>
-          </w:tcPr>
-          <w:p>
-            <w:r>
-              <w:t>Doctor mở phần Đơn thuốc thành công</w:t>
-            </w:r>
-          </w:p>
-        </w:tc>
-        <w:tc>
-          <w:tcPr>
-            <w:tcW w:type="dxa" w:w="1728"/>
-          </w:tcPr>
-          <w:p>
-            <w:r/>
-          </w:p>
-        </w:tc>
-      </w:tr>
-      <w:tr>
-        <w:tc>
-          <w:tcPr>
-            <w:tcW w:type="dxa" w:w="1728"/>
-          </w:tcPr>
-          <w:p>
-            <w:r>
-              <w:t>TC-NOTIFICATION-008</w:t>
-            </w:r>
-          </w:p>
-        </w:tc>
-        <w:tc>
-          <w:tcPr>
-            <w:tcW w:type="dxa" w:w="1728"/>
-          </w:tcPr>
-          <w:p>
-            <w:r>
-              <w:t>5</w:t>
-            </w:r>
-          </w:p>
-        </w:tc>
-        <w:tc>
-          <w:tcPr>
-            <w:tcW w:type="dxa" w:w="1728"/>
-          </w:tcPr>
-          <w:p>
-            <w:r>
-              <w:t>PASS</w:t>
-            </w:r>
-          </w:p>
-        </w:tc>
-        <w:tc>
-          <w:tcPr>
-            <w:tcW w:type="dxa" w:w="1728"/>
-          </w:tcPr>
-          <w:p>
-            <w:r>
-              <w:t>Nhập dữ liệu cho đơn thuốc thứ hai thành công</w:t>
-            </w:r>
-          </w:p>
-        </w:tc>
-        <w:tc>
-          <w:tcPr>
-            <w:tcW w:type="dxa" w:w="1728"/>
-          </w:tcPr>
-          <w:p>
-            <w:r/>
-          </w:p>
-        </w:tc>
-      </w:tr>
-      <w:tr>
-        <w:tc>
-          <w:tcPr>
-            <w:tcW w:type="dxa" w:w="1728"/>
-          </w:tcPr>
-          <w:p>
-            <w:r>
-              <w:t>TC-NOTIFICATION-008</w:t>
-            </w:r>
-          </w:p>
-        </w:tc>
-        <w:tc>
-          <w:tcPr>
-            <w:tcW w:type="dxa" w:w="1728"/>
-          </w:tcPr>
-          <w:p>
-            <w:r>
-              <w:t>6</w:t>
-            </w:r>
-          </w:p>
-        </w:tc>
-        <w:tc>
-          <w:tcPr>
-            <w:tcW w:type="dxa" w:w="1728"/>
-          </w:tcPr>
-          <w:p>
-            <w:r>
-              <w:t>PASS</w:t>
-            </w:r>
-          </w:p>
-        </w:tc>
-        <w:tc>
-          <w:tcPr>
-            <w:tcW w:type="dxa" w:w="1728"/>
-          </w:tcPr>
-          <w:p>
-            <w:r>
-              <w:t>Lưu đơn thuốc thứ hai thành công</w:t>
-            </w:r>
-          </w:p>
-        </w:tc>
-        <w:tc>
-          <w:tcPr>
-            <w:tcW w:type="dxa" w:w="1728"/>
-          </w:tcPr>
-          <w:p>
-            <w:r/>
-          </w:p>
-        </w:tc>
-      </w:tr>
-      <w:tr>
-        <w:tc>
-          <w:tcPr>
-            <w:tcW w:type="dxa" w:w="1728"/>
-          </w:tcPr>
-          <w:p>
-            <w:r>
-              <w:t>TC-NOTIFICATION-008</w:t>
-            </w:r>
-          </w:p>
-        </w:tc>
-        <w:tc>
-          <w:tcPr>
-            <w:tcW w:type="dxa" w:w="1728"/>
-          </w:tcPr>
-          <w:p>
-            <w:r>
-              <w:t>7</w:t>
-            </w:r>
-          </w:p>
-        </w:tc>
-        <w:tc>
-          <w:tcPr>
-            <w:tcW w:type="dxa" w:w="1728"/>
-          </w:tcPr>
-          <w:p>
-            <w:r>
-              <w:t>PASS</w:t>
-            </w:r>
-          </w:p>
-        </w:tc>
-        <w:tc>
-          <w:tcPr>
-            <w:tcW w:type="dxa" w:w="1728"/>
-          </w:tcPr>
-          <w:p>
-            <w:r>
-              <w:t>Đăng xuất Doctor và đăng nhập lại Patient thành công</w:t>
-            </w:r>
-          </w:p>
-        </w:tc>
-        <w:tc>
-          <w:tcPr>
-            <w:tcW w:type="dxa" w:w="1728"/>
-          </w:tcPr>
-          <w:p>
-            <w:r/>
-          </w:p>
-        </w:tc>
-      </w:tr>
-      <w:tr>
-        <w:tc>
-          <w:tcPr>
-            <w:tcW w:type="dxa" w:w="1728"/>
-          </w:tcPr>
-          <w:p>
-            <w:r>
-              <w:t>TC-NOTIFICATION-008</w:t>
-            </w:r>
-          </w:p>
-        </w:tc>
-        <w:tc>
-          <w:tcPr>
-            <w:tcW w:type="dxa" w:w="1728"/>
-          </w:tcPr>
-          <w:p>
-            <w:r>
-              <w:t>8</w:t>
-            </w:r>
-          </w:p>
-        </w:tc>
-        <w:tc>
-          <w:tcPr>
-            <w:tcW w:type="dxa" w:w="1728"/>
-          </w:tcPr>
-          <w:p>
-            <w:r>
-              <w:t>PASS</w:t>
-            </w:r>
-          </w:p>
-        </w:tc>
-        <w:tc>
-          <w:tcPr>
-            <w:tcW w:type="dxa" w:w="1728"/>
-          </w:tcPr>
-          <w:p>
-            <w:r>
-              <w:t>Patient mở trang Thông báo thành công</w:t>
-            </w:r>
-          </w:p>
-        </w:tc>
-        <w:tc>
-          <w:tcPr>
-            <w:tcW w:type="dxa" w:w="1728"/>
-          </w:tcPr>
-          <w:p>
-            <w:r/>
-          </w:p>
-        </w:tc>
-      </w:tr>
-      <w:tr>
-        <w:tc>
-          <w:tcPr>
-            <w:tcW w:type="dxa" w:w="1728"/>
-          </w:tcPr>
-          <w:p>
-            <w:r>
-              <w:t>TC-NOTIFICATION-008</w:t>
-            </w:r>
-          </w:p>
-        </w:tc>
-        <w:tc>
-          <w:tcPr>
-            <w:tcW w:type="dxa" w:w="1728"/>
-          </w:tcPr>
-          <w:p>
-            <w:r>
-              <w:t>9</w:t>
-            </w:r>
-          </w:p>
-        </w:tc>
-        <w:tc>
-          <w:tcPr>
-            <w:tcW w:type="dxa" w:w="1728"/>
-          </w:tcPr>
-          <w:p>
-            <w:r>
-              <w:t>PASS</w:t>
-            </w:r>
-          </w:p>
-        </w:tc>
-        <w:tc>
-          <w:tcPr>
-            <w:tcW w:type="dxa" w:w="1728"/>
-          </w:tcPr>
-          <w:p>
-            <w:r>
-              <w:t>Patient nhận notification mới của đơn thuốc thứ hai, không trùng notification cũ và đúng định dạng thời gian</w:t>
-            </w:r>
-          </w:p>
-        </w:tc>
-        <w:tc>
-          <w:tcPr>
-            <w:tcW w:type="dxa" w:w="1728"/>
-          </w:tcPr>
-          <w:p>
-            <w:r/>
-          </w:p>
-        </w:tc>
-      </w:tr>
-      <w:tr>
-        <w:tc>
-          <w:tcPr>
-            <w:tcW w:type="dxa" w:w="1728"/>
-          </w:tcPr>
-          <w:p>
-            <w:r>
-              <w:t>TC-NOTIFICATION-009</w:t>
-            </w:r>
-          </w:p>
-        </w:tc>
-        <w:tc>
-          <w:tcPr>
-            <w:tcW w:type="dxa" w:w="1728"/>
-          </w:tcPr>
-          <w:p>
-            <w:r>
-              <w:t>1</w:t>
-            </w:r>
-          </w:p>
-        </w:tc>
-        <w:tc>
-          <w:tcPr>
-            <w:tcW w:type="dxa" w:w="1728"/>
-          </w:tcPr>
-          <w:p>
-            <w:r>
-              <w:t>PASS</w:t>
-            </w:r>
-          </w:p>
-        </w:tc>
-        <w:tc>
-          <w:tcPr>
-            <w:tcW w:type="dxa" w:w="1728"/>
-          </w:tcPr>
-          <w:p>
-            <w:r>
-              <w:t>Chuẩn bị appointment #289, hồ sơ bệnh án ban đầu và ghi nhận 251 notification trước khi cập nhật</w:t>
-            </w:r>
-          </w:p>
-        </w:tc>
-        <w:tc>
-          <w:tcPr>
-            <w:tcW w:type="dxa" w:w="1728"/>
-          </w:tcPr>
-          <w:p>
-            <w:r/>
-          </w:p>
-        </w:tc>
-      </w:tr>
-      <w:tr>
-        <w:tc>
-          <w:tcPr>
-            <w:tcW w:type="dxa" w:w="1728"/>
-          </w:tcPr>
-          <w:p>
-            <w:r>
-              <w:t>TC-NOTIFICATION-009</w:t>
-            </w:r>
-          </w:p>
-        </w:tc>
-        <w:tc>
-          <w:tcPr>
-            <w:tcW w:type="dxa" w:w="1728"/>
-          </w:tcPr>
-          <w:p>
-            <w:r>
-              <w:t>2</w:t>
-            </w:r>
-          </w:p>
-        </w:tc>
-        <w:tc>
-          <w:tcPr>
-            <w:tcW w:type="dxa" w:w="1728"/>
-          </w:tcPr>
-          <w:p>
-            <w:r>
-              <w:t>PASS</w:t>
-            </w:r>
-          </w:p>
-        </w:tc>
-        <w:tc>
-          <w:tcPr>
-            <w:tcW w:type="dxa" w:w="1728"/>
-          </w:tcPr>
-          <w:p>
-            <w:r>
-              <w:t>Đăng nhập Doctor phụ trách thành công</w:t>
-            </w:r>
-          </w:p>
-        </w:tc>
-        <w:tc>
-          <w:tcPr>
-            <w:tcW w:type="dxa" w:w="1728"/>
-          </w:tcPr>
-          <w:p>
-            <w:r/>
-          </w:p>
-        </w:tc>
-      </w:tr>
-      <w:tr>
-        <w:tc>
-          <w:tcPr>
-            <w:tcW w:type="dxa" w:w="1728"/>
-          </w:tcPr>
-          <w:p>
-            <w:r>
-              <w:t>TC-NOTIFICATION-009</w:t>
-            </w:r>
-          </w:p>
-        </w:tc>
-        <w:tc>
-          <w:tcPr>
-            <w:tcW w:type="dxa" w:w="1728"/>
-          </w:tcPr>
-          <w:p>
-            <w:r>
-              <w:t>3</w:t>
-            </w:r>
-          </w:p>
-        </w:tc>
-        <w:tc>
-          <w:tcPr>
-            <w:tcW w:type="dxa" w:w="1728"/>
-          </w:tcPr>
-          <w:p>
-            <w:r>
-              <w:t>PASS</w:t>
-            </w:r>
-          </w:p>
-        </w:tc>
-        <w:tc>
-          <w:tcPr>
-            <w:tcW w:type="dxa" w:w="1728"/>
-          </w:tcPr>
-          <w:p>
-            <w:r>
-              <w:t>Doctor mở hồ sơ của appointment #289 thành công</w:t>
-            </w:r>
-          </w:p>
-        </w:tc>
-        <w:tc>
-          <w:tcPr>
-            <w:tcW w:type="dxa" w:w="1728"/>
-          </w:tcPr>
-          <w:p>
-            <w:r/>
-          </w:p>
-        </w:tc>
-      </w:tr>
-      <w:tr>
-        <w:tc>
-          <w:tcPr>
-            <w:tcW w:type="dxa" w:w="1728"/>
-          </w:tcPr>
-          <w:p>
-            <w:r>
-              <w:t>TC-NOTIFICATION-009</w:t>
-            </w:r>
-          </w:p>
-        </w:tc>
-        <w:tc>
-          <w:tcPr>
-            <w:tcW w:type="dxa" w:w="1728"/>
-          </w:tcPr>
-          <w:p>
-            <w:r>
-              <w:t>4</w:t>
-            </w:r>
-          </w:p>
-        </w:tc>
-        <w:tc>
-          <w:tcPr>
-            <w:tcW w:type="dxa" w:w="1728"/>
-          </w:tcPr>
-          <w:p>
-            <w:r>
-              <w:t>PASS</w:t>
-            </w:r>
-          </w:p>
-        </w:tc>
-        <w:tc>
-          <w:tcPr>
-            <w:tcW w:type="dxa" w:w="1728"/>
-          </w:tcPr>
-          <w:p>
-            <w:r>
-              <w:t>Doctor chỉnh sửa Chẩn đoán và Hướng điều trị thành công</w:t>
-            </w:r>
-          </w:p>
-        </w:tc>
-        <w:tc>
-          <w:tcPr>
-            <w:tcW w:type="dxa" w:w="1728"/>
-          </w:tcPr>
-          <w:p>
-            <w:r/>
-          </w:p>
-        </w:tc>
-      </w:tr>
-      <w:tr>
-        <w:tc>
-          <w:tcPr>
-            <w:tcW w:type="dxa" w:w="1728"/>
-          </w:tcPr>
-          <w:p>
-            <w:r>
-              <w:t>TC-NOTIFICATION-009</w:t>
-            </w:r>
-          </w:p>
-        </w:tc>
-        <w:tc>
-          <w:tcPr>
-            <w:tcW w:type="dxa" w:w="1728"/>
-          </w:tcPr>
-          <w:p>
-            <w:r>
-              <w:t>5</w:t>
-            </w:r>
-          </w:p>
-        </w:tc>
-        <w:tc>
-          <w:tcPr>
-            <w:tcW w:type="dxa" w:w="1728"/>
-          </w:tcPr>
-          <w:p>
-            <w:r>
-              <w:t>PASS</w:t>
-            </w:r>
-          </w:p>
-        </w:tc>
-        <w:tc>
-          <w:tcPr>
-            <w:tcW w:type="dxa" w:w="1728"/>
-          </w:tcPr>
-          <w:p>
-            <w:r>
-              <w:t>Cập nhật hồ sơ bệnh án thành công</w:t>
-            </w:r>
-          </w:p>
-        </w:tc>
-        <w:tc>
-          <w:tcPr>
-            <w:tcW w:type="dxa" w:w="1728"/>
-          </w:tcPr>
-          <w:p>
-            <w:r/>
-          </w:p>
-        </w:tc>
-      </w:tr>
-      <w:tr>
-        <w:tc>
-          <w:tcPr>
-            <w:tcW w:type="dxa" w:w="1728"/>
-          </w:tcPr>
-          <w:p>
-            <w:r>
-              <w:t>TC-NOTIFICATION-009</w:t>
-            </w:r>
-          </w:p>
-        </w:tc>
-        <w:tc>
-          <w:tcPr>
-            <w:tcW w:type="dxa" w:w="1728"/>
-          </w:tcPr>
-          <w:p>
-            <w:r>
-              <w:t>6</w:t>
-            </w:r>
-          </w:p>
-        </w:tc>
-        <w:tc>
-          <w:tcPr>
-            <w:tcW w:type="dxa" w:w="1728"/>
-          </w:tcPr>
-          <w:p>
-            <w:r>
-              <w:t>PASS</w:t>
-            </w:r>
-          </w:p>
-        </w:tc>
-        <w:tc>
-          <w:tcPr>
-            <w:tcW w:type="dxa" w:w="1728"/>
-          </w:tcPr>
-          <w:p>
-            <w:r>
-              <w:t>Đăng xuất Doctor và đăng nhập lại Patient thành công</w:t>
-            </w:r>
-          </w:p>
-        </w:tc>
-        <w:tc>
-          <w:tcPr>
-            <w:tcW w:type="dxa" w:w="1728"/>
-          </w:tcPr>
-          <w:p>
-            <w:r/>
-          </w:p>
-        </w:tc>
-      </w:tr>
-      <w:tr>
-        <w:tc>
-          <w:tcPr>
-            <w:tcW w:type="dxa" w:w="1728"/>
-          </w:tcPr>
-          <w:p>
-            <w:r>
-              <w:t>TC-NOTIFICATION-009</w:t>
-            </w:r>
-          </w:p>
-        </w:tc>
-        <w:tc>
-          <w:tcPr>
-            <w:tcW w:type="dxa" w:w="1728"/>
-          </w:tcPr>
-          <w:p>
-            <w:r>
-              <w:t>7</w:t>
-            </w:r>
-          </w:p>
-        </w:tc>
-        <w:tc>
-          <w:tcPr>
-            <w:tcW w:type="dxa" w:w="1728"/>
-          </w:tcPr>
-          <w:p>
-            <w:r>
-              <w:t>PASS</w:t>
-            </w:r>
-          </w:p>
-        </w:tc>
-        <w:tc>
-          <w:tcPr>
-            <w:tcW w:type="dxa" w:w="1728"/>
-          </w:tcPr>
-          <w:p>
-            <w:r>
-              <w:t>Patient mở trang Thông báo thành công</w:t>
-            </w:r>
-          </w:p>
-        </w:tc>
-        <w:tc>
-          <w:tcPr>
-            <w:tcW w:type="dxa" w:w="1728"/>
-          </w:tcPr>
-          <w:p>
-            <w:r/>
-          </w:p>
-        </w:tc>
-      </w:tr>
-      <w:tr>
-        <w:tc>
-          <w:tcPr>
-            <w:tcW w:type="dxa" w:w="1728"/>
-          </w:tcPr>
-          <w:p>
-            <w:r>
-              <w:t>TC-NOTIFICATION-009</w:t>
-            </w:r>
-          </w:p>
-        </w:tc>
-        <w:tc>
-          <w:tcPr>
-            <w:tcW w:type="dxa" w:w="1728"/>
-          </w:tcPr>
-          <w:p>
-            <w:r>
-              <w:t>8</w:t>
-            </w:r>
-          </w:p>
-        </w:tc>
-        <w:tc>
-          <w:tcPr>
-            <w:tcW w:type="dxa" w:w="1728"/>
+            <w:tcW w:type="dxa" w:w="1440"/>
           </w:tcPr>
           <w:p>
             <w:r>
@@ -4000,7 +860,17 @@
         </w:tc>
         <w:tc>
           <w:tcPr>
-            <w:tcW w:type="dxa" w:w="1728"/>
+            <w:tcW w:type="dxa" w:w="1440"/>
+          </w:tcPr>
+          <w:p>
+            <w:r>
+              <w:t>28/08/2026 10:23:37</w:t>
+            </w:r>
+          </w:p>
+        </w:tc>
+        <w:tc>
+          <w:tcPr>
+            <w:tcW w:type="dxa" w:w="1440"/>
           </w:tcPr>
           <w:p>
             <w:r>
@@ -4010,11 +880,11 @@
         </w:tc>
         <w:tc>
           <w:tcPr>
-            <w:tcW w:type="dxa" w:w="1728"/>
+            <w:tcW w:type="dxa" w:w="1440"/>
           </w:tcPr>
           <w:p>
             <w:r>
-              <w:t>Before: 251 | After: 251 | Known bug của hệ thống</w:t>
+              <w:t>Before: 259 | After: 259 | Known bug của hệ thống</w:t>
             </w:r>
           </w:p>
         </w:tc>

</xml_diff>

<commit_message>
refactor selenium tests and improve test reporting
</commit_message>
<xml_diff>
--- a/Selenium_WebDriver/reports/Notification_Test_Report.docx
+++ b/Selenium_WebDriver/reports/Notification_Test_Report.docx
@@ -21,7 +21,7 @@
         <w:jc w:val="center"/>
       </w:pPr>
       <w:r>
-        <w:t>Thời gian tạo báo cáo: 30/08/2026 22:54:13</w:t>
+        <w:t>Thời gian tạo báo cáo: 04/09/2026 01:56:18</w:t>
       </w:r>
     </w:p>
     <w:p/>
@@ -288,17 +288,17 @@
           </w:tcPr>
           <w:p>
             <w:r>
-              <w:t>30/08/2026 22:47:50</w:t>
-            </w:r>
-          </w:p>
-        </w:tc>
-        <w:tc>
-          <w:tcPr>
-            <w:tcW w:type="dxa" w:w="1440"/>
-          </w:tcPr>
-          <w:p>
-            <w:r>
-              <w:t>33.14</w:t>
+              <w:t>04/09/2026 01:47:53</w:t>
+            </w:r>
+          </w:p>
+        </w:tc>
+        <w:tc>
+          <w:tcPr>
+            <w:tcW w:type="dxa" w:w="1440"/>
+          </w:tcPr>
+          <w:p>
+            <w:r>
+              <w:t>33.10</w:t>
             </w:r>
           </w:p>
         </w:tc>
@@ -346,17 +346,17 @@
           </w:tcPr>
           <w:p>
             <w:r>
-              <w:t>30/08/2026 22:48:27</w:t>
-            </w:r>
-          </w:p>
-        </w:tc>
-        <w:tc>
-          <w:tcPr>
-            <w:tcW w:type="dxa" w:w="1440"/>
-          </w:tcPr>
-          <w:p>
-            <w:r>
-              <w:t>33.03</w:t>
+              <w:t>04/09/2026 01:48:29</w:t>
+            </w:r>
+          </w:p>
+        </w:tc>
+        <w:tc>
+          <w:tcPr>
+            <w:tcW w:type="dxa" w:w="1440"/>
+          </w:tcPr>
+          <w:p>
+            <w:r>
+              <w:t>33.10</w:t>
             </w:r>
           </w:p>
         </w:tc>
@@ -404,17 +404,17 @@
           </w:tcPr>
           <w:p>
             <w:r>
-              <w:t>30/08/2026 22:49:11</w:t>
-            </w:r>
-          </w:p>
-        </w:tc>
-        <w:tc>
-          <w:tcPr>
-            <w:tcW w:type="dxa" w:w="1440"/>
-          </w:tcPr>
-          <w:p>
-            <w:r>
-              <w:t>41.23</w:t>
+              <w:t>04/09/2026 01:49:13</w:t>
+            </w:r>
+          </w:p>
+        </w:tc>
+        <w:tc>
+          <w:tcPr>
+            <w:tcW w:type="dxa" w:w="1440"/>
+          </w:tcPr>
+          <w:p>
+            <w:r>
+              <w:t>40.96</w:t>
             </w:r>
           </w:p>
         </w:tc>
@@ -462,17 +462,17 @@
           </w:tcPr>
           <w:p>
             <w:r>
-              <w:t>30/08/2026 22:50:14</w:t>
-            </w:r>
-          </w:p>
-        </w:tc>
-        <w:tc>
-          <w:tcPr>
-            <w:tcW w:type="dxa" w:w="1440"/>
-          </w:tcPr>
-          <w:p>
-            <w:r>
-              <w:t>59.58</w:t>
+              <w:t>04/09/2026 01:50:16</w:t>
+            </w:r>
+          </w:p>
+        </w:tc>
+        <w:tc>
+          <w:tcPr>
+            <w:tcW w:type="dxa" w:w="1440"/>
+          </w:tcPr>
+          <w:p>
+            <w:r>
+              <w:t>59.09</w:t>
             </w:r>
           </w:p>
         </w:tc>
@@ -520,17 +520,17 @@
           </w:tcPr>
           <w:p>
             <w:r>
-              <w:t>30/08/2026 22:50:32</w:t>
-            </w:r>
-          </w:p>
-        </w:tc>
-        <w:tc>
-          <w:tcPr>
-            <w:tcW w:type="dxa" w:w="1440"/>
-          </w:tcPr>
-          <w:p>
-            <w:r>
-              <w:t>15.05</w:t>
+              <w:t>04/09/2026 01:50:35</w:t>
+            </w:r>
+          </w:p>
+        </w:tc>
+        <w:tc>
+          <w:tcPr>
+            <w:tcW w:type="dxa" w:w="1440"/>
+          </w:tcPr>
+          <w:p>
+            <w:r>
+              <w:t>15.97</w:t>
             </w:r>
           </w:p>
         </w:tc>
@@ -578,17 +578,17 @@
           </w:tcPr>
           <w:p>
             <w:r>
-              <w:t>30/08/2026 22:51:19</w:t>
-            </w:r>
-          </w:p>
-        </w:tc>
-        <w:tc>
-          <w:tcPr>
-            <w:tcW w:type="dxa" w:w="1440"/>
-          </w:tcPr>
-          <w:p>
-            <w:r>
-              <w:t>43.54</w:t>
+              <w:t>04/09/2026 01:51:21</w:t>
+            </w:r>
+          </w:p>
+        </w:tc>
+        <w:tc>
+          <w:tcPr>
+            <w:tcW w:type="dxa" w:w="1440"/>
+          </w:tcPr>
+          <w:p>
+            <w:r>
+              <w:t>43.21</w:t>
             </w:r>
           </w:p>
         </w:tc>
@@ -636,17 +636,17 @@
           </w:tcPr>
           <w:p>
             <w:r>
-              <w:t>30/08/2026 22:52:06</w:t>
-            </w:r>
-          </w:p>
-        </w:tc>
-        <w:tc>
-          <w:tcPr>
-            <w:tcW w:type="dxa" w:w="1440"/>
-          </w:tcPr>
-          <w:p>
-            <w:r>
-              <w:t>43.15</w:t>
+              <w:t>04/09/2026 01:52:08</w:t>
+            </w:r>
+          </w:p>
+        </w:tc>
+        <w:tc>
+          <w:tcPr>
+            <w:tcW w:type="dxa" w:w="1440"/>
+          </w:tcPr>
+          <w:p>
+            <w:r>
+              <w:t>43.11</w:t>
             </w:r>
           </w:p>
         </w:tc>
@@ -694,17 +694,17 @@
           </w:tcPr>
           <w:p>
             <w:r>
-              <w:t>30/08/2026 22:53:07</w:t>
-            </w:r>
-          </w:p>
-        </w:tc>
-        <w:tc>
-          <w:tcPr>
-            <w:tcW w:type="dxa" w:w="1440"/>
-          </w:tcPr>
-          <w:p>
-            <w:r>
-              <w:t>58.61</w:t>
+              <w:t>04/09/2026 01:53:09</w:t>
+            </w:r>
+          </w:p>
+        </w:tc>
+        <w:tc>
+          <w:tcPr>
+            <w:tcW w:type="dxa" w:w="1440"/>
+          </w:tcPr>
+          <w:p>
+            <w:r>
+              <w:t>58.08</w:t>
             </w:r>
           </w:p>
         </w:tc>
@@ -752,17 +752,17 @@
           </w:tcPr>
           <w:p>
             <w:r>
-              <w:t>30/08/2026 22:54:10</w:t>
-            </w:r>
-          </w:p>
-        </w:tc>
-        <w:tc>
-          <w:tcPr>
-            <w:tcW w:type="dxa" w:w="1440"/>
-          </w:tcPr>
-          <w:p>
-            <w:r>
-              <w:t>59.81</w:t>
+              <w:t>04/09/2026 01:54:14</w:t>
+            </w:r>
+          </w:p>
+        </w:tc>
+        <w:tc>
+          <w:tcPr>
+            <w:tcW w:type="dxa" w:w="1440"/>
+          </w:tcPr>
+          <w:p>
+            <w:r>
+              <w:t>61.17</w:t>
             </w:r>
           </w:p>
         </w:tc>
@@ -780,7 +780,9 @@
           </w:tcPr>
           <w:p>
             <w:r>
-              <w:t>KNOWN BUG - TC-NOTIFICATION-009 | STEP 8 | Trước khi cập nhật có 302 notification, sau khi cập nhật có 302. Hồ sơ bệnh án cập nhật thành công nhưng Patient không nhận được notification mới.</w:t>
+              <w:t>Known bug: Không phát sinh notification mới sau khi Doctor cập nhật hồ sơ bệnh án. | TC-NOTIFICATION-009 | STEP 8 FAILED | Expected số notification &gt; 432 | Actual: 432</w:t>
+              <w:br/>
+              <w:t>assert 432 &gt; 432</w:t>
             </w:r>
           </w:p>
         </w:tc>
@@ -908,17 +910,17 @@
           </w:tcPr>
           <w:p>
             <w:r>
-              <w:t>30/08/2026 22:47:36</w:t>
-            </w:r>
-          </w:p>
-        </w:tc>
-        <w:tc>
-          <w:tcPr>
-            <w:tcW w:type="dxa" w:w="1440"/>
-          </w:tcPr>
-          <w:p>
-            <w:r>
-              <w:t>Patient đặt lịch khám hợp lệ và appointment #375 ở trạng thái pending</w:t>
+              <w:t>04/09/2026 01:47:38</w:t>
+            </w:r>
+          </w:p>
+        </w:tc>
+        <w:tc>
+          <w:tcPr>
+            <w:tcW w:type="dxa" w:w="1440"/>
+          </w:tcPr>
+          <w:p>
+            <w:r>
+              <w:t>Patient đặt lịch hợp lệ, appointment #461 ở trạng thái pending</w:t>
             </w:r>
           </w:p>
         </w:tc>
@@ -968,7 +970,7 @@
           </w:tcPr>
           <w:p>
             <w:r>
-              <w:t>30/08/2026 22:47:42</w:t>
+              <w:t>04/09/2026 01:47:45</w:t>
             </w:r>
           </w:p>
         </w:tc>
@@ -1028,17 +1030,17 @@
           </w:tcPr>
           <w:p>
             <w:r>
-              <w:t>30/08/2026 22:47:44</w:t>
-            </w:r>
-          </w:p>
-        </w:tc>
-        <w:tc>
-          <w:tcPr>
-            <w:tcW w:type="dxa" w:w="1440"/>
-          </w:tcPr>
-          <w:p>
-            <w:r>
-              <w:t>Admin xác nhận appointment #375 thành công</w:t>
+              <w:t>04/09/2026 01:47:46</w:t>
+            </w:r>
+          </w:p>
+        </w:tc>
+        <w:tc>
+          <w:tcPr>
+            <w:tcW w:type="dxa" w:w="1440"/>
+          </w:tcPr>
+          <w:p>
+            <w:r>
+              <w:t>Admin xác nhận appointment #461 thành công</w:t>
             </w:r>
           </w:p>
         </w:tc>
@@ -1088,7 +1090,7 @@
           </w:tcPr>
           <w:p>
             <w:r>
-              <w:t>30/08/2026 22:47:50</w:t>
+              <w:t>04/09/2026 01:47:53</w:t>
             </w:r>
           </w:p>
         </w:tc>
@@ -1148,7 +1150,7 @@
           </w:tcPr>
           <w:p>
             <w:r>
-              <w:t>30/08/2026 22:47:50</w:t>
+              <w:t>04/09/2026 01:47:53</w:t>
             </w:r>
           </w:p>
         </w:tc>
@@ -1208,17 +1210,17 @@
           </w:tcPr>
           <w:p>
             <w:r>
-              <w:t>30/08/2026 22:47:50</w:t>
-            </w:r>
-          </w:p>
-        </w:tc>
-        <w:tc>
-          <w:tcPr>
-            <w:tcW w:type="dxa" w:w="1440"/>
-          </w:tcPr>
-          <w:p>
-            <w:r>
-              <w:t>Tìm thấy notification của appointment #375</w:t>
+              <w:t>04/09/2026 01:47:53</w:t>
+            </w:r>
+          </w:p>
+        </w:tc>
+        <w:tc>
+          <w:tcPr>
+            <w:tcW w:type="dxa" w:w="1440"/>
+          </w:tcPr>
+          <w:p>
+            <w:r>
+              <w:t>Tìm thấy notification của appointment #461</w:t>
             </w:r>
           </w:p>
         </w:tc>
@@ -1268,7 +1270,7 @@
           </w:tcPr>
           <w:p>
             <w:r>
-              <w:t>30/08/2026 22:47:50</w:t>
+              <w:t>04/09/2026 01:47:53</w:t>
             </w:r>
           </w:p>
         </w:tc>
@@ -1328,17 +1330,17 @@
           </w:tcPr>
           <w:p>
             <w:r>
-              <w:t>30/08/2026 22:48:13</w:t>
-            </w:r>
-          </w:p>
-        </w:tc>
-        <w:tc>
-          <w:tcPr>
-            <w:tcW w:type="dxa" w:w="1440"/>
-          </w:tcPr>
-          <w:p>
-            <w:r>
-              <w:t>Patient đặt lịch khám hợp lệ và appointment #376 ở trạng thái pending</w:t>
+              <w:t>04/09/2026 01:48:15</w:t>
+            </w:r>
+          </w:p>
+        </w:tc>
+        <w:tc>
+          <w:tcPr>
+            <w:tcW w:type="dxa" w:w="1440"/>
+          </w:tcPr>
+          <w:p>
+            <w:r>
+              <w:t>Patient đặt lịch hợp lệ, appointment #462 ở trạng thái pending</w:t>
             </w:r>
           </w:p>
         </w:tc>
@@ -1388,7 +1390,7 @@
           </w:tcPr>
           <w:p>
             <w:r>
-              <w:t>30/08/2026 22:48:19</w:t>
+              <w:t>04/09/2026 01:48:21</w:t>
             </w:r>
           </w:p>
         </w:tc>
@@ -1448,17 +1450,17 @@
           </w:tcPr>
           <w:p>
             <w:r>
-              <w:t>30/08/2026 22:48:20</w:t>
-            </w:r>
-          </w:p>
-        </w:tc>
-        <w:tc>
-          <w:tcPr>
-            <w:tcW w:type="dxa" w:w="1440"/>
-          </w:tcPr>
-          <w:p>
-            <w:r>
-              <w:t>Admin hủy appointment #376 thành công</w:t>
+              <w:t>04/09/2026 01:48:23</w:t>
+            </w:r>
+          </w:p>
+        </w:tc>
+        <w:tc>
+          <w:tcPr>
+            <w:tcW w:type="dxa" w:w="1440"/>
+          </w:tcPr>
+          <w:p>
+            <w:r>
+              <w:t>Admin hủy appointment #462 thành công</w:t>
             </w:r>
           </w:p>
         </w:tc>
@@ -1508,7 +1510,7 @@
           </w:tcPr>
           <w:p>
             <w:r>
-              <w:t>30/08/2026 22:48:26</w:t>
+              <w:t>04/09/2026 01:48:29</w:t>
             </w:r>
           </w:p>
         </w:tc>
@@ -1568,7 +1570,7 @@
           </w:tcPr>
           <w:p>
             <w:r>
-              <w:t>30/08/2026 22:48:27</w:t>
+              <w:t>04/09/2026 01:48:29</w:t>
             </w:r>
           </w:p>
         </w:tc>
@@ -1628,17 +1630,17 @@
           </w:tcPr>
           <w:p>
             <w:r>
-              <w:t>30/08/2026 22:48:27</w:t>
-            </w:r>
-          </w:p>
-        </w:tc>
-        <w:tc>
-          <w:tcPr>
-            <w:tcW w:type="dxa" w:w="1440"/>
-          </w:tcPr>
-          <w:p>
-            <w:r>
-              <w:t>Tìm thấy notification của appointment #376</w:t>
+              <w:t>04/09/2026 01:48:29</w:t>
+            </w:r>
+          </w:p>
+        </w:tc>
+        <w:tc>
+          <w:tcPr>
+            <w:tcW w:type="dxa" w:w="1440"/>
+          </w:tcPr>
+          <w:p>
+            <w:r>
+              <w:t>Tìm thấy notification của appointment #462</w:t>
             </w:r>
           </w:p>
         </w:tc>
@@ -1688,7 +1690,7 @@
           </w:tcPr>
           <w:p>
             <w:r>
-              <w:t>30/08/2026 22:48:27</w:t>
+              <w:t>04/09/2026 01:48:29</w:t>
             </w:r>
           </w:p>
         </w:tc>
@@ -1748,17 +1750,17 @@
           </w:tcPr>
           <w:p>
             <w:r>
-              <w:t>30/08/2026 22:48:57</w:t>
-            </w:r>
-          </w:p>
-        </w:tc>
-        <w:tc>
-          <w:tcPr>
-            <w:tcW w:type="dxa" w:w="1440"/>
-          </w:tcPr>
-          <w:p>
-            <w:r>
-              <w:t>Chuẩn bị appointment #377 và Admin xác nhận lịch thành công</w:t>
+              <w:t>04/09/2026 01:48:59</w:t>
+            </w:r>
+          </w:p>
+        </w:tc>
+        <w:tc>
+          <w:tcPr>
+            <w:tcW w:type="dxa" w:w="1440"/>
+          </w:tcPr>
+          <w:p>
+            <w:r>
+              <w:t>Chuẩn bị appointment #463 và Admin xác nhận lịch thành công</w:t>
             </w:r>
           </w:p>
         </w:tc>
@@ -1808,7 +1810,7 @@
           </w:tcPr>
           <w:p>
             <w:r>
-              <w:t>30/08/2026 22:49:03</w:t>
+              <w:t>04/09/2026 01:49:05</w:t>
             </w:r>
           </w:p>
         </w:tc>
@@ -1868,17 +1870,17 @@
           </w:tcPr>
           <w:p>
             <w:r>
-              <w:t>30/08/2026 22:49:04</w:t>
-            </w:r>
-          </w:p>
-        </w:tc>
-        <w:tc>
-          <w:tcPr>
-            <w:tcW w:type="dxa" w:w="1440"/>
-          </w:tcPr>
-          <w:p>
-            <w:r>
-              <w:t>Doctor mở appointment #377 và vào màn hình Khám bệnh thành công</w:t>
+              <w:t>04/09/2026 01:49:06</w:t>
+            </w:r>
+          </w:p>
+        </w:tc>
+        <w:tc>
+          <w:tcPr>
+            <w:tcW w:type="dxa" w:w="1440"/>
+          </w:tcPr>
+          <w:p>
+            <w:r>
+              <w:t>Doctor mở appointment #463 và vào màn hình Khám bệnh thành công</w:t>
             </w:r>
           </w:p>
         </w:tc>
@@ -1928,7 +1930,7 @@
           </w:tcPr>
           <w:p>
             <w:r>
-              <w:t>30/08/2026 22:49:04</w:t>
+              <w:t>04/09/2026 01:49:06</w:t>
             </w:r>
           </w:p>
         </w:tc>
@@ -1988,7 +1990,7 @@
           </w:tcPr>
           <w:p>
             <w:r>
-              <w:t>30/08/2026 22:49:05</w:t>
+              <w:t>04/09/2026 01:49:07</w:t>
             </w:r>
           </w:p>
         </w:tc>
@@ -2048,7 +2050,7 @@
           </w:tcPr>
           <w:p>
             <w:r>
-              <w:t>30/08/2026 22:49:11</w:t>
+              <w:t>04/09/2026 01:49:13</w:t>
             </w:r>
           </w:p>
         </w:tc>
@@ -2108,7 +2110,7 @@
           </w:tcPr>
           <w:p>
             <w:r>
-              <w:t>30/08/2026 22:49:11</w:t>
+              <w:t>04/09/2026 01:49:13</w:t>
             </w:r>
           </w:p>
         </w:tc>
@@ -2168,7 +2170,7 @@
           </w:tcPr>
           <w:p>
             <w:r>
-              <w:t>30/08/2026 22:49:11</w:t>
+              <w:t>04/09/2026 01:49:13</w:t>
             </w:r>
           </w:p>
         </w:tc>
@@ -2228,17 +2230,17 @@
           </w:tcPr>
           <w:p>
             <w:r>
-              <w:t>30/08/2026 22:49:47</w:t>
-            </w:r>
-          </w:p>
-        </w:tc>
-        <w:tc>
-          <w:tcPr>
-            <w:tcW w:type="dxa" w:w="1440"/>
-          </w:tcPr>
-          <w:p>
-            <w:r>
-              <w:t>Tạo appointment cũ #378, Admin xác nhận và Patient nhận notification cũ</w:t>
+              <w:t>04/09/2026 01:49:49</w:t>
+            </w:r>
+          </w:p>
+        </w:tc>
+        <w:tc>
+          <w:tcPr>
+            <w:tcW w:type="dxa" w:w="1440"/>
+          </w:tcPr>
+          <w:p>
+            <w:r>
+              <w:t>Patient đã có notification cũ của appointment #464</w:t>
             </w:r>
           </w:p>
         </w:tc>
@@ -2288,17 +2290,17 @@
           </w:tcPr>
           <w:p>
             <w:r>
-              <w:t>30/08/2026 22:50:00</w:t>
-            </w:r>
-          </w:p>
-        </w:tc>
-        <w:tc>
-          <w:tcPr>
-            <w:tcW w:type="dxa" w:w="1440"/>
-          </w:tcPr>
-          <w:p>
-            <w:r>
-              <w:t>Patient tạo appointment mới #379, khác appointment cũ #378</w:t>
+              <w:t>04/09/2026 01:50:02</w:t>
+            </w:r>
+          </w:p>
+        </w:tc>
+        <w:tc>
+          <w:tcPr>
+            <w:tcW w:type="dxa" w:w="1440"/>
+          </w:tcPr>
+          <w:p>
+            <w:r>
+              <w:t>Patient tạo appointment mới #465, khác appointment cũ #464</w:t>
             </w:r>
           </w:p>
         </w:tc>
@@ -2348,17 +2350,17 @@
           </w:tcPr>
           <w:p>
             <w:r>
-              <w:t>30/08/2026 22:50:07</w:t>
-            </w:r>
-          </w:p>
-        </w:tc>
-        <w:tc>
-          <w:tcPr>
-            <w:tcW w:type="dxa" w:w="1440"/>
-          </w:tcPr>
-          <w:p>
-            <w:r>
-              <w:t>Admin xác nhận appointment mới #379 thành công</w:t>
+              <w:t>04/09/2026 01:50:09</w:t>
+            </w:r>
+          </w:p>
+        </w:tc>
+        <w:tc>
+          <w:tcPr>
+            <w:tcW w:type="dxa" w:w="1440"/>
+          </w:tcPr>
+          <w:p>
+            <w:r>
+              <w:t>Admin xác nhận appointment mới #465 thành công</w:t>
             </w:r>
           </w:p>
         </w:tc>
@@ -2408,7 +2410,7 @@
           </w:tcPr>
           <w:p>
             <w:r>
-              <w:t>30/08/2026 22:50:14</w:t>
+              <w:t>04/09/2026 01:50:15</w:t>
             </w:r>
           </w:p>
         </w:tc>
@@ -2468,7 +2470,7 @@
           </w:tcPr>
           <w:p>
             <w:r>
-              <w:t>30/08/2026 22:50:14</w:t>
+              <w:t>04/09/2026 01:50:16</w:t>
             </w:r>
           </w:p>
         </w:tc>
@@ -2528,17 +2530,17 @@
           </w:tcPr>
           <w:p>
             <w:r>
-              <w:t>30/08/2026 22:50:14</w:t>
-            </w:r>
-          </w:p>
-        </w:tc>
-        <w:tc>
-          <w:tcPr>
-            <w:tcW w:type="dxa" w:w="1440"/>
-          </w:tcPr>
-          <w:p>
-            <w:r>
-              <w:t>Notification mới của appointment #379 hiển thị đúng</w:t>
+              <w:t>04/09/2026 01:50:16</w:t>
+            </w:r>
+          </w:p>
+        </w:tc>
+        <w:tc>
+          <w:tcPr>
+            <w:tcW w:type="dxa" w:w="1440"/>
+          </w:tcPr>
+          <w:p>
+            <w:r>
+              <w:t>Notification mới của appointment #465 hiển thị đúng</w:t>
             </w:r>
           </w:p>
         </w:tc>
@@ -2588,17 +2590,17 @@
           </w:tcPr>
           <w:p>
             <w:r>
-              <w:t>30/08/2026 22:50:14</w:t>
-            </w:r>
-          </w:p>
-        </w:tc>
-        <w:tc>
-          <w:tcPr>
-            <w:tcW w:type="dxa" w:w="1440"/>
-          </w:tcPr>
-          <w:p>
-            <w:r>
-              <w:t>Notification #378 và #379 được lưu độc lập, không ghi đè nhau</w:t>
+              <w:t>04/09/2026 01:50:16</w:t>
+            </w:r>
+          </w:p>
+        </w:tc>
+        <w:tc>
+          <w:tcPr>
+            <w:tcW w:type="dxa" w:w="1440"/>
+          </w:tcPr>
+          <w:p>
+            <w:r>
+              <w:t>Notification #464 và #465 được lưu riêng biệt, không ghi đè nhau</w:t>
             </w:r>
           </w:p>
         </w:tc>
@@ -2648,7 +2650,7 @@
           </w:tcPr>
           <w:p>
             <w:r>
-              <w:t>30/08/2026 22:50:24</w:t>
+              <w:t>04/09/2026 01:50:25</w:t>
             </w:r>
           </w:p>
         </w:tc>
@@ -2708,17 +2710,17 @@
           </w:tcPr>
           <w:p>
             <w:r>
-              <w:t>30/08/2026 22:50:26</w:t>
-            </w:r>
-          </w:p>
-        </w:tc>
-        <w:tc>
-          <w:tcPr>
-            <w:tcW w:type="dxa" w:w="1440"/>
-          </w:tcPr>
-          <w:p>
-            <w:r>
-              <w:t>Patient A có 290 notification</w:t>
+              <w:t>04/09/2026 01:50:28</w:t>
+            </w:r>
+          </w:p>
+        </w:tc>
+        <w:tc>
+          <w:tcPr>
+            <w:tcW w:type="dxa" w:w="1440"/>
+          </w:tcPr>
+          <w:p>
+            <w:r>
+              <w:t>Patient A có 420 notification</w:t>
             </w:r>
           </w:p>
         </w:tc>
@@ -2768,7 +2770,7 @@
           </w:tcPr>
           <w:p>
             <w:r>
-              <w:t>30/08/2026 22:50:32</w:t>
+              <w:t>04/09/2026 01:50:35</w:t>
             </w:r>
           </w:p>
         </w:tc>
@@ -2828,7 +2830,7 @@
           </w:tcPr>
           <w:p>
             <w:r>
-              <w:t>30/08/2026 22:50:32</w:t>
+              <w:t>04/09/2026 01:50:35</w:t>
             </w:r>
           </w:p>
         </w:tc>
@@ -2888,17 +2890,17 @@
           </w:tcPr>
           <w:p>
             <w:r>
-              <w:t>30/08/2026 22:50:32</w:t>
-            </w:r>
-          </w:p>
-        </w:tc>
-        <w:tc>
-          <w:tcPr>
-            <w:tcW w:type="dxa" w:w="1440"/>
-          </w:tcPr>
-          <w:p>
-            <w:r>
-              <w:t>Danh sách notification của Patient A và Patient B được phân tách, không giống nhau</w:t>
+              <w:t>04/09/2026 01:50:35</w:t>
+            </w:r>
+          </w:p>
+        </w:tc>
+        <w:tc>
+          <w:tcPr>
+            <w:tcW w:type="dxa" w:w="1440"/>
+          </w:tcPr>
+          <w:p>
+            <w:r>
+              <w:t>Danh sách notification của Patient A và Patient B được phân tách riêng</w:t>
             </w:r>
           </w:p>
         </w:tc>
@@ -2948,17 +2950,17 @@
           </w:tcPr>
           <w:p>
             <w:r>
-              <w:t>30/08/2026 22:51:02</w:t>
-            </w:r>
-          </w:p>
-        </w:tc>
-        <w:tc>
-          <w:tcPr>
-            <w:tcW w:type="dxa" w:w="1440"/>
-          </w:tcPr>
-          <w:p>
-            <w:r>
-              <w:t>Chuẩn bị appointment #380 và Admin xác nhận lịch thành công</w:t>
+              <w:t>04/09/2026 01:51:05</w:t>
+            </w:r>
+          </w:p>
+        </w:tc>
+        <w:tc>
+          <w:tcPr>
+            <w:tcW w:type="dxa" w:w="1440"/>
+          </w:tcPr>
+          <w:p>
+            <w:r>
+              <w:t>Chuẩn bị appointment #466 và Admin xác nhận lịch thành công</w:t>
             </w:r>
           </w:p>
         </w:tc>
@@ -3008,7 +3010,7 @@
           </w:tcPr>
           <w:p>
             <w:r>
-              <w:t>30/08/2026 22:51:08</w:t>
+              <w:t>04/09/2026 01:51:11</w:t>
             </w:r>
           </w:p>
         </w:tc>
@@ -3068,17 +3070,17 @@
           </w:tcPr>
           <w:p>
             <w:r>
-              <w:t>30/08/2026 22:51:09</w:t>
-            </w:r>
-          </w:p>
-        </w:tc>
-        <w:tc>
-          <w:tcPr>
-            <w:tcW w:type="dxa" w:w="1440"/>
-          </w:tcPr>
-          <w:p>
-            <w:r>
-              <w:t>Doctor mở appointment #380 và vào màn hình Khám bệnh thành công</w:t>
+              <w:t>04/09/2026 01:51:12</w:t>
+            </w:r>
+          </w:p>
+        </w:tc>
+        <w:tc>
+          <w:tcPr>
+            <w:tcW w:type="dxa" w:w="1440"/>
+          </w:tcPr>
+          <w:p>
+            <w:r>
+              <w:t>Doctor mở appointment #466 và vào màn hình Khám bệnh thành công</w:t>
             </w:r>
           </w:p>
         </w:tc>
@@ -3128,7 +3130,7 @@
           </w:tcPr>
           <w:p>
             <w:r>
-              <w:t>30/08/2026 22:51:10</w:t>
+              <w:t>04/09/2026 01:51:12</w:t>
             </w:r>
           </w:p>
         </w:tc>
@@ -3188,7 +3190,7 @@
           </w:tcPr>
           <w:p>
             <w:r>
-              <w:t>30/08/2026 22:51:10</w:t>
+              <w:t>04/09/2026 01:51:13</w:t>
             </w:r>
           </w:p>
         </w:tc>
@@ -3248,7 +3250,7 @@
           </w:tcPr>
           <w:p>
             <w:r>
-              <w:t>30/08/2026 22:51:11</w:t>
+              <w:t>04/09/2026 01:51:13</w:t>
             </w:r>
           </w:p>
         </w:tc>
@@ -3308,17 +3310,17 @@
           </w:tcPr>
           <w:p>
             <w:r>
-              <w:t>30/08/2026 22:51:13</w:t>
-            </w:r>
-          </w:p>
-        </w:tc>
-        <w:tc>
-          <w:tcPr>
-            <w:tcW w:type="dxa" w:w="1440"/>
-          </w:tcPr>
-          <w:p>
-            <w:r>
-              <w:t>Doctor tạo và lưu đơn thuốc với thuốc 'Selenium Drug Valid 1788102388 - tồn kho: 107 viên' thành công</w:t>
+              <w:t>04/09/2026 01:51:15</w:t>
+            </w:r>
+          </w:p>
+        </w:tc>
+        <w:tc>
+          <w:tcPr>
+            <w:tcW w:type="dxa" w:w="1440"/>
+          </w:tcPr>
+          <w:p>
+            <w:r>
+              <w:t>Doctor tạo và lưu đơn thuốc với 'Selenium Drug Valid 1788105547 - tồn kho: 91 viên' thành công</w:t>
             </w:r>
           </w:p>
         </w:tc>
@@ -3368,7 +3370,7 @@
           </w:tcPr>
           <w:p>
             <w:r>
-              <w:t>30/08/2026 22:51:19</w:t>
+              <w:t>04/09/2026 01:51:21</w:t>
             </w:r>
           </w:p>
         </w:tc>
@@ -3428,7 +3430,7 @@
           </w:tcPr>
           <w:p>
             <w:r>
-              <w:t>30/08/2026 22:51:19</w:t>
+              <w:t>04/09/2026 01:51:21</w:t>
             </w:r>
           </w:p>
         </w:tc>
@@ -3488,17 +3490,17 @@
           </w:tcPr>
           <w:p>
             <w:r>
-              <w:t>30/08/2026 22:51:57</w:t>
-            </w:r>
-          </w:p>
-        </w:tc>
-        <w:tc>
-          <w:tcPr>
-            <w:tcW w:type="dxa" w:w="1440"/>
-          </w:tcPr>
-          <w:p>
-            <w:r>
-              <w:t>Chuẩn bị appointment #381, Admin xác nhận và Doctor tạo hồ sơ bệnh án thành công</w:t>
+              <w:t>04/09/2026 01:51:59</w:t>
+            </w:r>
+          </w:p>
+        </w:tc>
+        <w:tc>
+          <w:tcPr>
+            <w:tcW w:type="dxa" w:w="1440"/>
+          </w:tcPr>
+          <w:p>
+            <w:r>
+              <w:t>Chuẩn bị appointment #467, Admin xác nhận và Doctor tạo hồ sơ bệnh án thành công</w:t>
             </w:r>
           </w:p>
         </w:tc>
@@ -3548,7 +3550,7 @@
           </w:tcPr>
           <w:p>
             <w:r>
-              <w:t>30/08/2026 22:51:57</w:t>
+              <w:t>04/09/2026 01:51:59</w:t>
             </w:r>
           </w:p>
         </w:tc>
@@ -3608,17 +3610,17 @@
           </w:tcPr>
           <w:p>
             <w:r>
-              <w:t>30/08/2026 22:51:57</w:t>
-            </w:r>
-          </w:p>
-        </w:tc>
-        <w:tc>
-          <w:tcPr>
-            <w:tcW w:type="dxa" w:w="1440"/>
-          </w:tcPr>
-          <w:p>
-            <w:r>
-              <w:t>Mở hồ sơ bệnh án của appointment #381 thành công</w:t>
+              <w:t>04/09/2026 01:52:00</w:t>
+            </w:r>
+          </w:p>
+        </w:tc>
+        <w:tc>
+          <w:tcPr>
+            <w:tcW w:type="dxa" w:w="1440"/>
+          </w:tcPr>
+          <w:p>
+            <w:r>
+              <w:t>Mở hồ sơ bệnh án của appointment #467 thành công</w:t>
             </w:r>
           </w:p>
         </w:tc>
@@ -3668,7 +3670,7 @@
           </w:tcPr>
           <w:p>
             <w:r>
-              <w:t>30/08/2026 22:51:58</w:t>
+              <w:t>04/09/2026 01:52:00</w:t>
             </w:r>
           </w:p>
         </w:tc>
@@ -3728,17 +3730,17 @@
           </w:tcPr>
           <w:p>
             <w:r>
-              <w:t>30/08/2026 22:51:58</w:t>
-            </w:r>
-          </w:p>
-        </w:tc>
-        <w:tc>
-          <w:tcPr>
-            <w:tcW w:type="dxa" w:w="1440"/>
-          </w:tcPr>
-          <w:p>
-            <w:r>
-              <w:t>Nhập xét nghiệm 'Xet nghiem mau TC-NOTIFICATION-007-1788105089' và kết quả hợp lệ</w:t>
+              <w:t>04/09/2026 01:52:01</w:t>
+            </w:r>
+          </w:p>
+        </w:tc>
+        <w:tc>
+          <w:tcPr>
+            <w:tcW w:type="dxa" w:w="1440"/>
+          </w:tcPr>
+          <w:p>
+            <w:r>
+              <w:t>Nhập xét nghiệm 'Xet nghiem mau TC-NOTIFICATION-007-1788461518' và kết quả hợp lệ</w:t>
             </w:r>
           </w:p>
         </w:tc>
@@ -3788,17 +3790,17 @@
           </w:tcPr>
           <w:p>
             <w:r>
-              <w:t>30/08/2026 22:51:59</w:t>
-            </w:r>
-          </w:p>
-        </w:tc>
-        <w:tc>
-          <w:tcPr>
-            <w:tcW w:type="dxa" w:w="1440"/>
-          </w:tcPr>
-          <w:p>
-            <w:r>
-              <w:t>Lưu kết quả xét nghiệm 'Xet nghiem mau TC-NOTIFICATION-007-1788105089' thành công</w:t>
+              <w:t>04/09/2026 01:52:01</w:t>
+            </w:r>
+          </w:p>
+        </w:tc>
+        <w:tc>
+          <w:tcPr>
+            <w:tcW w:type="dxa" w:w="1440"/>
+          </w:tcPr>
+          <w:p>
+            <w:r>
+              <w:t>Lưu kết quả xét nghiệm 'Xet nghiem mau TC-NOTIFICATION-007-1788461518' thành công</w:t>
             </w:r>
           </w:p>
         </w:tc>
@@ -3848,7 +3850,7 @@
           </w:tcPr>
           <w:p>
             <w:r>
-              <w:t>30/08/2026 22:52:05</w:t>
+              <w:t>04/09/2026 01:52:07</w:t>
             </w:r>
           </w:p>
         </w:tc>
@@ -3908,7 +3910,7 @@
           </w:tcPr>
           <w:p>
             <w:r>
-              <w:t>30/08/2026 22:52:05</w:t>
+              <w:t>04/09/2026 01:52:08</w:t>
             </w:r>
           </w:p>
         </w:tc>
@@ -3968,17 +3970,17 @@
           </w:tcPr>
           <w:p>
             <w:r>
-              <w:t>30/08/2026 22:52:06</w:t>
-            </w:r>
-          </w:p>
-        </w:tc>
-        <w:tc>
-          <w:tcPr>
-            <w:tcW w:type="dxa" w:w="1440"/>
-          </w:tcPr>
-          <w:p>
-            <w:r>
-              <w:t>Patient nhận notification cho xét nghiệm 'Xet nghiem mau TC-NOTIFICATION-007-1788105089' đúng loại, nội dung và thời gian</w:t>
+              <w:t>04/09/2026 01:52:08</w:t>
+            </w:r>
+          </w:p>
+        </w:tc>
+        <w:tc>
+          <w:tcPr>
+            <w:tcW w:type="dxa" w:w="1440"/>
+          </w:tcPr>
+          <w:p>
+            <w:r>
+              <w:t>Patient nhận notification cho xét nghiệm 'Xet nghiem mau TC-NOTIFICATION-007-1788461518' đúng loại, nội dung và thời gian</w:t>
             </w:r>
           </w:p>
         </w:tc>
@@ -4028,17 +4030,17 @@
           </w:tcPr>
           <w:p>
             <w:r>
-              <w:t>30/08/2026 22:52:46</w:t>
-            </w:r>
-          </w:p>
-        </w:tc>
-        <w:tc>
-          <w:tcPr>
-            <w:tcW w:type="dxa" w:w="1440"/>
-          </w:tcPr>
-          <w:p>
-            <w:r>
-              <w:t>Chuẩn bị appointment #382, hồ sơ bệnh án và đơn thuốc thứ nhất thành công</w:t>
+              <w:t>04/09/2026 01:52:48</w:t>
+            </w:r>
+          </w:p>
+        </w:tc>
+        <w:tc>
+          <w:tcPr>
+            <w:tcW w:type="dxa" w:w="1440"/>
+          </w:tcPr>
+          <w:p>
+            <w:r>
+              <w:t>Chuẩn bị appointment #468, hồ sơ bệnh án và đơn thuốc thứ nhất thành công</w:t>
             </w:r>
           </w:p>
         </w:tc>
@@ -4088,7 +4090,7 @@
           </w:tcPr>
           <w:p>
             <w:r>
-              <w:t>30/08/2026 22:52:52</w:t>
+              <w:t>04/09/2026 01:52:54</w:t>
             </w:r>
           </w:p>
         </w:tc>
@@ -4148,7 +4150,7 @@
           </w:tcPr>
           <w:p>
             <w:r>
-              <w:t>30/08/2026 22:52:59</w:t>
+              <w:t>04/09/2026 01:53:00</w:t>
             </w:r>
           </w:p>
         </w:tc>
@@ -4208,7 +4210,7 @@
           </w:tcPr>
           <w:p>
             <w:r>
-              <w:t>30/08/2026 22:52:59</w:t>
+              <w:t>04/09/2026 01:53:01</w:t>
             </w:r>
           </w:p>
         </w:tc>
@@ -4268,7 +4270,7 @@
           </w:tcPr>
           <w:p>
             <w:r>
-              <w:t>30/08/2026 22:53:00</w:t>
+              <w:t>04/09/2026 01:53:02</w:t>
             </w:r>
           </w:p>
         </w:tc>
@@ -4328,7 +4330,7 @@
           </w:tcPr>
           <w:p>
             <w:r>
-              <w:t>30/08/2026 22:53:01</w:t>
+              <w:t>04/09/2026 01:53:03</w:t>
             </w:r>
           </w:p>
         </w:tc>
@@ -4388,7 +4390,7 @@
           </w:tcPr>
           <w:p>
             <w:r>
-              <w:t>30/08/2026 22:53:07</w:t>
+              <w:t>04/09/2026 01:53:09</w:t>
             </w:r>
           </w:p>
         </w:tc>
@@ -4448,7 +4450,7 @@
           </w:tcPr>
           <w:p>
             <w:r>
-              <w:t>30/08/2026 22:53:07</w:t>
+              <w:t>04/09/2026 01:53:09</w:t>
             </w:r>
           </w:p>
         </w:tc>
@@ -4508,7 +4510,7 @@
           </w:tcPr>
           <w:p>
             <w:r>
-              <w:t>30/08/2026 22:53:07</w:t>
+              <w:t>04/09/2026 01:53:09</w:t>
             </w:r>
           </w:p>
         </w:tc>
@@ -4568,17 +4570,17 @@
           </w:tcPr>
           <w:p>
             <w:r>
-              <w:t>30/08/2026 22:53:54</w:t>
-            </w:r>
-          </w:p>
-        </w:tc>
-        <w:tc>
-          <w:tcPr>
-            <w:tcW w:type="dxa" w:w="1440"/>
-          </w:tcPr>
-          <w:p>
-            <w:r>
-              <w:t>Chuẩn bị appointment #383, hồ sơ bệnh án ban đầu và ghi nhận 302 notification trước khi cập nhật</w:t>
+              <w:t>04/09/2026 01:53:56</w:t>
+            </w:r>
+          </w:p>
+        </w:tc>
+        <w:tc>
+          <w:tcPr>
+            <w:tcW w:type="dxa" w:w="1440"/>
+          </w:tcPr>
+          <w:p>
+            <w:r>
+              <w:t>Chuẩn bị appointment #469, hồ sơ bệnh án ban đầu và ghi nhận 432 notification trước khi cập nhật</w:t>
             </w:r>
           </w:p>
         </w:tc>
@@ -4628,7 +4630,7 @@
           </w:tcPr>
           <w:p>
             <w:r>
-              <w:t>30/08/2026 22:54:00</w:t>
+              <w:t>04/09/2026 01:54:02</w:t>
             </w:r>
           </w:p>
         </w:tc>
@@ -4688,17 +4690,17 @@
           </w:tcPr>
           <w:p>
             <w:r>
-              <w:t>30/08/2026 22:54:00</w:t>
-            </w:r>
-          </w:p>
-        </w:tc>
-        <w:tc>
-          <w:tcPr>
-            <w:tcW w:type="dxa" w:w="1440"/>
-          </w:tcPr>
-          <w:p>
-            <w:r>
-              <w:t>Doctor mở hồ sơ của appointment #383 thành công</w:t>
+              <w:t>04/09/2026 01:54:02</w:t>
+            </w:r>
+          </w:p>
+        </w:tc>
+        <w:tc>
+          <w:tcPr>
+            <w:tcW w:type="dxa" w:w="1440"/>
+          </w:tcPr>
+          <w:p>
+            <w:r>
+              <w:t>Doctor mở hồ sơ của appointment #469 thành công</w:t>
             </w:r>
           </w:p>
         </w:tc>
@@ -4748,7 +4750,7 @@
           </w:tcPr>
           <w:p>
             <w:r>
-              <w:t>30/08/2026 22:54:01</w:t>
+              <w:t>04/09/2026 01:54:03</w:t>
             </w:r>
           </w:p>
         </w:tc>
@@ -4808,7 +4810,7 @@
           </w:tcPr>
           <w:p>
             <w:r>
-              <w:t>30/08/2026 22:54:02</w:t>
+              <w:t>04/09/2026 01:54:04</w:t>
             </w:r>
           </w:p>
         </w:tc>
@@ -4868,7 +4870,7 @@
           </w:tcPr>
           <w:p>
             <w:r>
-              <w:t>30/08/2026 22:54:08</w:t>
+              <w:t>04/09/2026 01:54:10</w:t>
             </w:r>
           </w:p>
         </w:tc>
@@ -4928,7 +4930,7 @@
           </w:tcPr>
           <w:p>
             <w:r>
-              <w:t>30/08/2026 22:54:09</w:t>
+              <w:t>04/09/2026 01:54:11</w:t>
             </w:r>
           </w:p>
         </w:tc>
@@ -4988,27 +4990,29 @@
           </w:tcPr>
           <w:p>
             <w:r>
-              <w:t>30/08/2026 22:54:10</w:t>
-            </w:r>
-          </w:p>
-        </w:tc>
-        <w:tc>
-          <w:tcPr>
-            <w:tcW w:type="dxa" w:w="1440"/>
-          </w:tcPr>
-          <w:p>
-            <w:r>
-              <w:t>Không phát sinh notification mới sau khi Doctor cập nhật hồ sơ bệnh án</w:t>
-            </w:r>
-          </w:p>
-        </w:tc>
-        <w:tc>
-          <w:tcPr>
-            <w:tcW w:type="dxa" w:w="1440"/>
-          </w:tcPr>
-          <w:p>
-            <w:r>
-              <w:t>Before: 302 | After: 302 | Known bug của hệ thống</w:t>
+              <w:t>04/09/2026 01:54:14</w:t>
+            </w:r>
+          </w:p>
+        </w:tc>
+        <w:tc>
+          <w:tcPr>
+            <w:tcW w:type="dxa" w:w="1440"/>
+          </w:tcPr>
+          <w:p>
+            <w:r>
+              <w:t>Known bug - Step không đạt Expected Result</w:t>
+            </w:r>
+          </w:p>
+        </w:tc>
+        <w:tc>
+          <w:tcPr>
+            <w:tcW w:type="dxa" w:w="1440"/>
+          </w:tcPr>
+          <w:p>
+            <w:r>
+              <w:t>TC-NOTIFICATION-009 | STEP 8 FAILED | Expected số notification &gt; 432 | Actual: 432</w:t>
+              <w:br/>
+              <w:t>assert 432 &gt; 432</w:t>
             </w:r>
           </w:p>
         </w:tc>

</xml_diff>